<commit_message>
feat: implement core domain models, document generation engine, and React-based voucher management UI for the Meridian Voucher Studio project.
</commit_message>
<xml_diff>
--- a/templates/voucher-template.docx
+++ b/templates/voucher-template.docx
@@ -8,10 +8,10 @@
         <w:autoSpaceDE w:val="0"/>
         <w:autoSpaceDN w:val="0"/>
         <w:adjustRightInd w:val="0"/>
-        <w:spacing w:after="0" w:line="240" w:lineRule="auto"/>
+        <w:spacing w:after="0" w:line="276" w:lineRule="auto"/>
         <w:jc w:val="center"/>
         <w:rPr>
-          <w:rFonts w:ascii="Arial" w:hAnsi="Arial" w:cs="Arial"/>
+          <w:rFonts w:cs="Calibri"/>
           <w:b/>
           <w:bCs/>
           <w:color w:val="000000"/>
@@ -22,7 +22,7 @@
       </w:pPr>
       <w:r>
         <w:rPr>
-          <w:rFonts w:ascii="Arial" w:hAnsi="Arial" w:cs="Arial"/>
+          <w:rFonts w:cs="Calibri"/>
           <w:b/>
           <w:bCs/>
           <w:color w:val="000000"/>
@@ -35,7 +35,7 @@
       <w:proofErr w:type="spellStart"/>
       <w:r>
         <w:rPr>
-          <w:rFonts w:ascii="Arial" w:hAnsi="Arial" w:cs="Arial"/>
+          <w:rFonts w:cs="Calibri"/>
           <w:b/>
           <w:bCs/>
           <w:color w:val="000000"/>
@@ -48,7 +48,7 @@
       <w:proofErr w:type="spellEnd"/>
       <w:r>
         <w:rPr>
-          <w:rFonts w:ascii="Arial" w:hAnsi="Arial" w:cs="Arial"/>
+          <w:rFonts w:cs="Calibri"/>
           <w:b/>
           <w:bCs/>
           <w:color w:val="000000"/>
@@ -65,10 +65,10 @@
         <w:autoSpaceDE w:val="0"/>
         <w:autoSpaceDN w:val="0"/>
         <w:adjustRightInd w:val="0"/>
-        <w:spacing w:after="0" w:line="240" w:lineRule="auto"/>
+        <w:spacing w:after="0" w:line="276" w:lineRule="auto"/>
         <w:jc w:val="center"/>
         <w:rPr>
-          <w:rFonts w:ascii="Arial" w:hAnsi="Arial" w:cs="Arial"/>
+          <w:rFonts w:cs="Calibri"/>
           <w:b/>
           <w:bCs/>
           <w:color w:val="000000"/>
@@ -84,10 +84,10 @@
         <w:autoSpaceDE w:val="0"/>
         <w:autoSpaceDN w:val="0"/>
         <w:adjustRightInd w:val="0"/>
-        <w:spacing w:after="0" w:line="240" w:lineRule="auto"/>
+        <w:spacing w:after="0" w:line="276" w:lineRule="auto"/>
         <w:jc w:val="center"/>
         <w:rPr>
-          <w:rFonts w:ascii="Arial" w:hAnsi="Arial" w:cs="Arial"/>
+          <w:rFonts w:cs="Calibri"/>
           <w:b/>
           <w:bCs/>
           <w:color w:val="000000"/>
@@ -99,17 +99,17 @@
     </w:p>
     <w:p>
       <w:pPr>
-        <w:spacing w:after="0"/>
-        <w:rPr>
-          <w:rFonts w:ascii="Arial" w:hAnsi="Arial" w:cs="Arial"/>
-          <w:color w:val="000000"/>
-          <w:sz w:val="20"/>
-          <w:szCs w:val="20"/>
-        </w:rPr>
-      </w:pPr>
-      <w:r>
-        <w:rPr>
-          <w:rFonts w:ascii="Arial" w:hAnsi="Arial" w:cs="Arial"/>
+        <w:spacing w:after="0" w:line="276" w:lineRule="auto"/>
+        <w:rPr>
+          <w:rFonts w:cs="Calibri"/>
+          <w:color w:val="000000"/>
+          <w:sz w:val="20"/>
+          <w:szCs w:val="20"/>
+        </w:rPr>
+      </w:pPr>
+      <w:r>
+        <w:rPr>
+          <w:rFonts w:cs="Calibri"/>
           <w:b/>
           <w:bCs/>
           <w:color w:val="000000"/>
@@ -120,7 +120,7 @@
       </w:r>
       <w:r>
         <w:rPr>
-          <w:rFonts w:ascii="Arial" w:hAnsi="Arial" w:cs="Arial"/>
+          <w:rFonts w:cs="Calibri"/>
           <w:b/>
           <w:bCs/>
           <w:color w:val="000000"/>
@@ -131,7 +131,7 @@
       </w:r>
       <w:r>
         <w:rPr>
-          <w:rFonts w:ascii="Arial" w:hAnsi="Arial" w:cs="Arial"/>
+          <w:rFonts w:cs="Calibri"/>
           <w:b/>
           <w:bCs/>
           <w:color w:val="000000"/>
@@ -142,7 +142,7 @@
       </w:r>
       <w:r>
         <w:rPr>
-          <w:rFonts w:ascii="Arial" w:hAnsi="Arial" w:cs="Arial"/>
+          <w:rFonts w:cs="Calibri"/>
           <w:color w:val="000000"/>
           <w:sz w:val="20"/>
           <w:szCs w:val="20"/>
@@ -151,7 +151,7 @@
       </w:r>
       <w:r>
         <w:rPr>
-          <w:rFonts w:ascii="Arial" w:hAnsi="Arial" w:cs="Arial"/>
+          <w:rFonts w:cs="Calibri"/>
           <w:color w:val="000000"/>
           <w:sz w:val="20"/>
           <w:szCs w:val="20"/>
@@ -161,16 +161,25 @@
       <w:proofErr w:type="spellStart"/>
       <w:r>
         <w:rPr>
-          <w:rFonts w:ascii="Arial" w:hAnsi="Arial" w:cs="Arial"/>
-          <w:color w:val="000000"/>
-          <w:sz w:val="20"/>
-          <w:szCs w:val="20"/>
-        </w:rPr>
-        <w:t>Hotel</w:t>
-      </w:r>
-      <w:r>
-        <w:rPr>
-          <w:rFonts w:ascii="Arial" w:hAnsi="Arial" w:cs="Arial"/>
+          <w:rFonts w:cs="Calibri"/>
+          <w:color w:val="000000"/>
+          <w:sz w:val="20"/>
+          <w:szCs w:val="20"/>
+        </w:rPr>
+        <w:t>h</w:t>
+      </w:r>
+      <w:r>
+        <w:rPr>
+          <w:rFonts w:cs="Calibri"/>
+          <w:color w:val="000000"/>
+          <w:sz w:val="20"/>
+          <w:szCs w:val="20"/>
+        </w:rPr>
+        <w:t>otel</w:t>
+      </w:r>
+      <w:r>
+        <w:rPr>
+          <w:rFonts w:cs="Calibri"/>
           <w:color w:val="000000"/>
           <w:sz w:val="20"/>
           <w:szCs w:val="20"/>
@@ -179,7 +188,7 @@
       </w:r>
       <w:r>
         <w:rPr>
-          <w:rFonts w:ascii="Arial" w:hAnsi="Arial" w:cs="Arial"/>
+          <w:rFonts w:cs="Calibri"/>
           <w:color w:val="000000"/>
           <w:sz w:val="20"/>
           <w:szCs w:val="20"/>
@@ -189,7 +198,7 @@
       <w:proofErr w:type="spellEnd"/>
       <w:r>
         <w:rPr>
-          <w:rFonts w:ascii="Arial" w:hAnsi="Arial" w:cs="Arial"/>
+          <w:rFonts w:cs="Calibri"/>
           <w:color w:val="000000"/>
           <w:sz w:val="20"/>
           <w:szCs w:val="20"/>
@@ -199,17 +208,17 @@
     </w:p>
     <w:p>
       <w:pPr>
-        <w:spacing w:after="0"/>
-        <w:rPr>
-          <w:rFonts w:ascii="Arial" w:hAnsi="Arial" w:cs="Arial"/>
-          <w:color w:val="000000"/>
-          <w:sz w:val="20"/>
-          <w:szCs w:val="20"/>
-        </w:rPr>
-      </w:pPr>
-      <w:r>
-        <w:rPr>
-          <w:rFonts w:ascii="Arial" w:hAnsi="Arial" w:cs="Arial"/>
+        <w:spacing w:after="0" w:line="276" w:lineRule="auto"/>
+        <w:rPr>
+          <w:rFonts w:cs="Calibri"/>
+          <w:color w:val="000000"/>
+          <w:sz w:val="20"/>
+          <w:szCs w:val="20"/>
+        </w:rPr>
+      </w:pPr>
+      <w:r>
+        <w:rPr>
+          <w:rFonts w:cs="Calibri"/>
           <w:b/>
           <w:bCs/>
           <w:color w:val="000000"/>
@@ -220,7 +229,7 @@
       </w:r>
       <w:r>
         <w:rPr>
-          <w:rFonts w:ascii="Arial" w:hAnsi="Arial" w:cs="Arial"/>
+          <w:rFonts w:cs="Calibri"/>
           <w:color w:val="000000"/>
           <w:sz w:val="20"/>
           <w:szCs w:val="20"/>
@@ -231,7 +240,7 @@
       <w:proofErr w:type="spellStart"/>
       <w:r>
         <w:rPr>
-          <w:rFonts w:ascii="Arial" w:hAnsi="Arial" w:cs="Arial"/>
+          <w:rFonts w:cs="Calibri"/>
           <w:color w:val="000000"/>
           <w:sz w:val="20"/>
           <w:szCs w:val="20"/>
@@ -241,7 +250,7 @@
       <w:proofErr w:type="spellEnd"/>
       <w:r>
         <w:rPr>
-          <w:rFonts w:ascii="Arial" w:hAnsi="Arial" w:cs="Arial"/>
+          <w:rFonts w:cs="Calibri"/>
           <w:color w:val="000000"/>
           <w:sz w:val="20"/>
           <w:szCs w:val="20"/>
@@ -251,17 +260,17 @@
     </w:p>
     <w:p>
       <w:pPr>
-        <w:spacing w:after="0"/>
-        <w:rPr>
-          <w:rFonts w:ascii="Arial" w:hAnsi="Arial" w:cs="Arial"/>
-          <w:color w:val="000000"/>
-          <w:sz w:val="20"/>
-          <w:szCs w:val="20"/>
-        </w:rPr>
-      </w:pPr>
-      <w:r>
-        <w:rPr>
-          <w:rFonts w:ascii="Arial" w:hAnsi="Arial" w:cs="Arial"/>
+        <w:spacing w:after="0" w:line="276" w:lineRule="auto"/>
+        <w:rPr>
+          <w:rFonts w:cs="Calibri"/>
+          <w:color w:val="000000"/>
+          <w:sz w:val="20"/>
+          <w:szCs w:val="20"/>
+        </w:rPr>
+      </w:pPr>
+      <w:r>
+        <w:rPr>
+          <w:rFonts w:cs="Calibri"/>
           <w:b/>
           <w:bCs/>
           <w:color w:val="000000"/>
@@ -272,7 +281,76 @@
       </w:r>
       <w:r>
         <w:rPr>
-          <w:rFonts w:ascii="Arial" w:hAnsi="Arial" w:cs="Arial"/>
+          <w:rFonts w:cs="Calibri"/>
+          <w:color w:val="000000"/>
+          <w:sz w:val="20"/>
+          <w:szCs w:val="20"/>
+        </w:rPr>
+        <w:tab/>
+      </w:r>
+      <w:r>
+        <w:rPr>
+          <w:rFonts w:cs="Calibri"/>
+          <w:color w:val="000000"/>
+          <w:sz w:val="20"/>
+          <w:szCs w:val="20"/>
+        </w:rPr>
+        <w:tab/>
+      </w:r>
+      <w:r>
+        <w:rPr>
+          <w:rFonts w:cs="Calibri"/>
+          <w:color w:val="000000"/>
+          <w:sz w:val="20"/>
+          <w:szCs w:val="20"/>
+        </w:rPr>
+        <w:t>: {</w:t>
+      </w:r>
+      <w:proofErr w:type="spellStart"/>
+      <w:r>
+        <w:rPr>
+          <w:rFonts w:cs="Calibri"/>
+          <w:color w:val="000000"/>
+          <w:sz w:val="20"/>
+          <w:szCs w:val="20"/>
+        </w:rPr>
+        <w:t>tourNo</w:t>
+      </w:r>
+      <w:proofErr w:type="spellEnd"/>
+      <w:r>
+        <w:rPr>
+          <w:rFonts w:cs="Calibri"/>
+          <w:color w:val="000000"/>
+          <w:sz w:val="20"/>
+          <w:szCs w:val="20"/>
+        </w:rPr>
+        <w:t>}</w:t>
+      </w:r>
+    </w:p>
+    <w:p>
+      <w:pPr>
+        <w:spacing w:after="0" w:line="276" w:lineRule="auto"/>
+        <w:rPr>
+          <w:rFonts w:cs="Calibri"/>
+          <w:color w:val="000000"/>
+          <w:sz w:val="20"/>
+          <w:szCs w:val="20"/>
+        </w:rPr>
+      </w:pPr>
+      <w:r>
+        <w:rPr>
+          <w:rFonts w:cs="Calibri"/>
+          <w:b/>
+          <w:bCs/>
+          <w:color w:val="000000"/>
+          <w:sz w:val="20"/>
+          <w:szCs w:val="20"/>
+        </w:rPr>
+        <w:t>Tour Name</w:t>
+      </w:r>
+      <w:r>
+        <w:rPr>
+          <w:rFonts w:cs="Calibri"/>
           <w:color w:val="000000"/>
           <w:sz w:val="20"/>
           <w:szCs w:val="20"/>
@@ -283,17 +361,26 @@
       <w:proofErr w:type="spellStart"/>
       <w:r>
         <w:rPr>
-          <w:rFonts w:ascii="Arial" w:hAnsi="Arial" w:cs="Arial"/>
-          <w:color w:val="000000"/>
-          <w:sz w:val="20"/>
-          <w:szCs w:val="20"/>
-        </w:rPr>
-        <w:t>tourNo</w:t>
+          <w:rFonts w:cs="Calibri"/>
+          <w:color w:val="000000"/>
+          <w:sz w:val="20"/>
+          <w:szCs w:val="20"/>
+        </w:rPr>
+        <w:t>t</w:t>
+      </w:r>
+      <w:r>
+        <w:rPr>
+          <w:rFonts w:cs="Calibri"/>
+          <w:color w:val="000000"/>
+          <w:sz w:val="20"/>
+          <w:szCs w:val="20"/>
+        </w:rPr>
+        <w:t>ourName</w:t>
       </w:r>
       <w:proofErr w:type="spellEnd"/>
       <w:r>
         <w:rPr>
-          <w:rFonts w:ascii="Arial" w:hAnsi="Arial" w:cs="Arial"/>
+          <w:rFonts w:cs="Calibri"/>
           <w:color w:val="000000"/>
           <w:sz w:val="20"/>
           <w:szCs w:val="20"/>
@@ -303,28 +390,37 @@
     </w:p>
     <w:p>
       <w:pPr>
-        <w:spacing w:after="0"/>
-        <w:rPr>
-          <w:rFonts w:ascii="Arial" w:hAnsi="Arial" w:cs="Arial"/>
-          <w:color w:val="000000"/>
-          <w:sz w:val="20"/>
-          <w:szCs w:val="20"/>
-        </w:rPr>
-      </w:pPr>
-      <w:r>
-        <w:rPr>
-          <w:rFonts w:ascii="Arial" w:hAnsi="Arial" w:cs="Arial"/>
+        <w:spacing w:after="0" w:line="276" w:lineRule="auto"/>
+        <w:rPr>
+          <w:rFonts w:cs="Calibri"/>
+          <w:color w:val="000000"/>
+          <w:sz w:val="20"/>
+          <w:szCs w:val="20"/>
+        </w:rPr>
+      </w:pPr>
+      <w:r>
+        <w:rPr>
+          <w:rFonts w:cs="Calibri"/>
           <w:b/>
           <w:bCs/>
           <w:color w:val="000000"/>
           <w:sz w:val="20"/>
           <w:szCs w:val="20"/>
         </w:rPr>
-        <w:t>Tour Name</w:t>
-      </w:r>
-      <w:r>
-        <w:rPr>
-          <w:rFonts w:ascii="Arial" w:hAnsi="Arial" w:cs="Arial"/>
+        <w:t>Customer</w:t>
+      </w:r>
+      <w:r>
+        <w:rPr>
+          <w:rFonts w:cs="Calibri"/>
+          <w:color w:val="000000"/>
+          <w:sz w:val="20"/>
+          <w:szCs w:val="20"/>
+        </w:rPr>
+        <w:t xml:space="preserve"> </w:t>
+      </w:r>
+      <w:r>
+        <w:rPr>
+          <w:rFonts w:cs="Calibri"/>
           <w:color w:val="000000"/>
           <w:sz w:val="20"/>
           <w:szCs w:val="20"/>
@@ -335,17 +431,17 @@
       <w:proofErr w:type="spellStart"/>
       <w:r>
         <w:rPr>
-          <w:rFonts w:ascii="Arial" w:hAnsi="Arial" w:cs="Arial"/>
-          <w:color w:val="000000"/>
-          <w:sz w:val="20"/>
-          <w:szCs w:val="20"/>
-        </w:rPr>
-        <w:t>TourName</w:t>
+          <w:rFonts w:cs="Calibri"/>
+          <w:color w:val="000000"/>
+          <w:sz w:val="20"/>
+          <w:szCs w:val="20"/>
+        </w:rPr>
+        <w:t>customerName</w:t>
       </w:r>
       <w:proofErr w:type="spellEnd"/>
       <w:r>
         <w:rPr>
-          <w:rFonts w:ascii="Arial" w:hAnsi="Arial" w:cs="Arial"/>
+          <w:rFonts w:cs="Calibri"/>
           <w:color w:val="000000"/>
           <w:sz w:val="20"/>
           <w:szCs w:val="20"/>
@@ -355,22 +451,23 @@
     </w:p>
     <w:tbl>
       <w:tblPr>
-        <w:tblStyle w:val="PlainTable1"/>
+        <w:tblStyle w:val="PlainTable4"/>
         <w:tblpPr w:leftFromText="180" w:rightFromText="180" w:vertAnchor="text" w:horzAnchor="margin" w:tblpXSpec="center" w:tblpY="426"/>
-        <w:tblW w:w="10265" w:type="dxa"/>
+        <w:tblW w:w="11515" w:type="dxa"/>
         <w:tblLayout w:type="fixed"/>
         <w:tblLook w:val="04A0" w:firstRow="1" w:lastRow="0" w:firstColumn="1" w:lastColumn="0" w:noHBand="0" w:noVBand="1"/>
       </w:tblPr>
       <w:tblGrid>
-        <w:gridCol w:w="1715"/>
-        <w:gridCol w:w="1768"/>
-        <w:gridCol w:w="889"/>
-        <w:gridCol w:w="705"/>
-        <w:gridCol w:w="705"/>
-        <w:gridCol w:w="785"/>
-        <w:gridCol w:w="666"/>
-        <w:gridCol w:w="1592"/>
-        <w:gridCol w:w="1440"/>
+        <w:gridCol w:w="1885"/>
+        <w:gridCol w:w="1625"/>
+        <w:gridCol w:w="985"/>
+        <w:gridCol w:w="900"/>
+        <w:gridCol w:w="900"/>
+        <w:gridCol w:w="810"/>
+        <w:gridCol w:w="810"/>
+        <w:gridCol w:w="900"/>
+        <w:gridCol w:w="1280"/>
+        <w:gridCol w:w="1420"/>
       </w:tblGrid>
       <w:tr>
         <w:trPr>
@@ -380,7 +477,7 @@
         <w:tc>
           <w:tcPr>
             <w:cnfStyle w:val="001000000000" w:firstRow="0" w:lastRow="0" w:firstColumn="1" w:lastColumn="0" w:oddVBand="0" w:evenVBand="0" w:oddHBand="0" w:evenHBand="0" w:firstRowFirstColumn="0" w:firstRowLastColumn="0" w:lastRowFirstColumn="0" w:lastRowLastColumn="0"/>
-            <w:tcW w:w="1715" w:type="dxa"/>
+            <w:tcW w:w="1885" w:type="dxa"/>
           </w:tcPr>
           <w:p>
             <w:pPr>
@@ -388,9 +485,10 @@
               <w:autoSpaceDE w:val="0"/>
               <w:autoSpaceDN w:val="0"/>
               <w:adjustRightInd w:val="0"/>
+              <w:spacing w:line="276" w:lineRule="auto"/>
               <w:jc w:val="center"/>
               <w:rPr>
-                <w:rFonts w:ascii="Arial" w:hAnsi="Arial" w:cs="Arial"/>
+                <w:rFonts w:cs="Calibri"/>
                 <w:color w:val="000000"/>
                 <w:sz w:val="20"/>
                 <w:szCs w:val="20"/>
@@ -398,10 +496,10 @@
             </w:pPr>
             <w:r>
               <w:rPr>
-                <w:rFonts w:ascii="Arial" w:hAnsi="Arial" w:cs="Arial"/>
-                <w:color w:val="000000"/>
-                <w:sz w:val="20"/>
-                <w:szCs w:val="20"/>
+                <w:rFonts w:cs="Calibri"/>
+                <w:color w:val="000000"/>
+                <w:sz w:val="16"/>
+                <w:szCs w:val="16"/>
               </w:rPr>
               <w:t>Required Date</w:t>
             </w:r>
@@ -409,7 +507,7 @@
         </w:tc>
         <w:tc>
           <w:tcPr>
-            <w:tcW w:w="1768" w:type="dxa"/>
+            <w:tcW w:w="1625" w:type="dxa"/>
           </w:tcPr>
           <w:p>
             <w:pPr>
@@ -417,10 +515,11 @@
               <w:autoSpaceDE w:val="0"/>
               <w:autoSpaceDN w:val="0"/>
               <w:adjustRightInd w:val="0"/>
+              <w:spacing w:line="276" w:lineRule="auto"/>
               <w:jc w:val="center"/>
               <w:cnfStyle w:val="100000000000" w:firstRow="1" w:lastRow="0" w:firstColumn="0" w:lastColumn="0" w:oddVBand="0" w:evenVBand="0" w:oddHBand="0" w:evenHBand="0" w:firstRowFirstColumn="0" w:firstRowLastColumn="0" w:lastRowFirstColumn="0" w:lastRowLastColumn="0"/>
               <w:rPr>
-                <w:rFonts w:ascii="Arial" w:hAnsi="Arial" w:cs="Arial"/>
+                <w:rFonts w:cs="Calibri"/>
                 <w:color w:val="000000"/>
                 <w:sz w:val="20"/>
                 <w:szCs w:val="20"/>
@@ -428,10 +527,10 @@
             </w:pPr>
             <w:r>
               <w:rPr>
-                <w:rFonts w:ascii="Arial" w:hAnsi="Arial" w:cs="Arial"/>
-                <w:color w:val="000000"/>
-                <w:sz w:val="20"/>
-                <w:szCs w:val="20"/>
+                <w:rFonts w:cs="Calibri"/>
+                <w:color w:val="000000"/>
+                <w:sz w:val="16"/>
+                <w:szCs w:val="16"/>
               </w:rPr>
               <w:t>Room Category</w:t>
             </w:r>
@@ -439,7 +538,7 @@
         </w:tc>
         <w:tc>
           <w:tcPr>
-            <w:tcW w:w="889" w:type="dxa"/>
+            <w:tcW w:w="985" w:type="dxa"/>
           </w:tcPr>
           <w:p>
             <w:pPr>
@@ -447,10 +546,11 @@
               <w:autoSpaceDE w:val="0"/>
               <w:autoSpaceDN w:val="0"/>
               <w:adjustRightInd w:val="0"/>
+              <w:spacing w:line="276" w:lineRule="auto"/>
               <w:jc w:val="center"/>
               <w:cnfStyle w:val="100000000000" w:firstRow="1" w:lastRow="0" w:firstColumn="0" w:lastColumn="0" w:oddVBand="0" w:evenVBand="0" w:oddHBand="0" w:evenHBand="0" w:firstRowFirstColumn="0" w:firstRowLastColumn="0" w:lastRowFirstColumn="0" w:lastRowLastColumn="0"/>
               <w:rPr>
-                <w:rFonts w:ascii="Arial" w:hAnsi="Arial" w:cs="Arial"/>
+                <w:rFonts w:cs="Calibri"/>
                 <w:color w:val="000000"/>
                 <w:sz w:val="20"/>
                 <w:szCs w:val="20"/>
@@ -458,10 +558,10 @@
             </w:pPr>
             <w:r>
               <w:rPr>
-                <w:rFonts w:ascii="Arial" w:hAnsi="Arial" w:cs="Arial"/>
-                <w:color w:val="000000"/>
-                <w:sz w:val="20"/>
-                <w:szCs w:val="20"/>
+                <w:rFonts w:cs="Calibri"/>
+                <w:color w:val="000000"/>
+                <w:sz w:val="16"/>
+                <w:szCs w:val="16"/>
               </w:rPr>
               <w:t>Basis</w:t>
             </w:r>
@@ -469,7 +569,7 @@
         </w:tc>
         <w:tc>
           <w:tcPr>
-            <w:tcW w:w="705" w:type="dxa"/>
+            <w:tcW w:w="900" w:type="dxa"/>
           </w:tcPr>
           <w:p>
             <w:pPr>
@@ -477,10 +577,11 @@
               <w:autoSpaceDE w:val="0"/>
               <w:autoSpaceDN w:val="0"/>
               <w:adjustRightInd w:val="0"/>
+              <w:spacing w:line="276" w:lineRule="auto"/>
               <w:jc w:val="center"/>
               <w:cnfStyle w:val="100000000000" w:firstRow="1" w:lastRow="0" w:firstColumn="0" w:lastColumn="0" w:oddVBand="0" w:evenVBand="0" w:oddHBand="0" w:evenHBand="0" w:firstRowFirstColumn="0" w:firstRowLastColumn="0" w:lastRowFirstColumn="0" w:lastRowLastColumn="0"/>
               <w:rPr>
-                <w:rFonts w:ascii="Arial" w:hAnsi="Arial" w:cs="Arial"/>
+                <w:rFonts w:cs="Calibri"/>
                 <w:color w:val="000000"/>
                 <w:sz w:val="20"/>
                 <w:szCs w:val="20"/>
@@ -488,10 +589,10 @@
             </w:pPr>
             <w:r>
               <w:rPr>
-                <w:rFonts w:ascii="Arial" w:hAnsi="Arial" w:cs="Arial"/>
-                <w:color w:val="000000"/>
-                <w:sz w:val="20"/>
-                <w:szCs w:val="20"/>
+                <w:rFonts w:cs="Calibri"/>
+                <w:color w:val="000000"/>
+                <w:sz w:val="16"/>
+                <w:szCs w:val="16"/>
               </w:rPr>
               <w:t>SGL</w:t>
             </w:r>
@@ -499,7 +600,7 @@
         </w:tc>
         <w:tc>
           <w:tcPr>
-            <w:tcW w:w="705" w:type="dxa"/>
+            <w:tcW w:w="900" w:type="dxa"/>
           </w:tcPr>
           <w:p>
             <w:pPr>
@@ -507,10 +608,11 @@
               <w:autoSpaceDE w:val="0"/>
               <w:autoSpaceDN w:val="0"/>
               <w:adjustRightInd w:val="0"/>
+              <w:spacing w:line="276" w:lineRule="auto"/>
               <w:jc w:val="center"/>
               <w:cnfStyle w:val="100000000000" w:firstRow="1" w:lastRow="0" w:firstColumn="0" w:lastColumn="0" w:oddVBand="0" w:evenVBand="0" w:oddHBand="0" w:evenHBand="0" w:firstRowFirstColumn="0" w:firstRowLastColumn="0" w:lastRowFirstColumn="0" w:lastRowLastColumn="0"/>
               <w:rPr>
-                <w:rFonts w:ascii="Arial" w:hAnsi="Arial" w:cs="Arial"/>
+                <w:rFonts w:cs="Calibri"/>
                 <w:color w:val="000000"/>
                 <w:sz w:val="20"/>
                 <w:szCs w:val="20"/>
@@ -518,10 +620,10 @@
             </w:pPr>
             <w:r>
               <w:rPr>
-                <w:rFonts w:ascii="Arial" w:hAnsi="Arial" w:cs="Arial"/>
-                <w:color w:val="000000"/>
-                <w:sz w:val="20"/>
-                <w:szCs w:val="20"/>
+                <w:rFonts w:cs="Calibri"/>
+                <w:color w:val="000000"/>
+                <w:sz w:val="16"/>
+                <w:szCs w:val="16"/>
               </w:rPr>
               <w:t>DBL</w:t>
             </w:r>
@@ -529,7 +631,7 @@
         </w:tc>
         <w:tc>
           <w:tcPr>
-            <w:tcW w:w="785" w:type="dxa"/>
+            <w:tcW w:w="810" w:type="dxa"/>
           </w:tcPr>
           <w:p>
             <w:pPr>
@@ -537,10 +639,11 @@
               <w:autoSpaceDE w:val="0"/>
               <w:autoSpaceDN w:val="0"/>
               <w:adjustRightInd w:val="0"/>
+              <w:spacing w:line="276" w:lineRule="auto"/>
               <w:jc w:val="center"/>
               <w:cnfStyle w:val="100000000000" w:firstRow="1" w:lastRow="0" w:firstColumn="0" w:lastColumn="0" w:oddVBand="0" w:evenVBand="0" w:oddHBand="0" w:evenHBand="0" w:firstRowFirstColumn="0" w:firstRowLastColumn="0" w:lastRowFirstColumn="0" w:lastRowLastColumn="0"/>
               <w:rPr>
-                <w:rFonts w:ascii="Arial" w:hAnsi="Arial" w:cs="Arial"/>
+                <w:rFonts w:cs="Calibri"/>
                 <w:color w:val="000000"/>
                 <w:sz w:val="20"/>
                 <w:szCs w:val="20"/>
@@ -548,10 +651,10 @@
             </w:pPr>
             <w:r>
               <w:rPr>
-                <w:rFonts w:ascii="Arial" w:hAnsi="Arial" w:cs="Arial"/>
-                <w:color w:val="000000"/>
-                <w:sz w:val="20"/>
-                <w:szCs w:val="20"/>
+                <w:rFonts w:cs="Calibri"/>
+                <w:color w:val="000000"/>
+                <w:sz w:val="16"/>
+                <w:szCs w:val="16"/>
               </w:rPr>
               <w:t>TWN</w:t>
             </w:r>
@@ -559,7 +662,7 @@
         </w:tc>
         <w:tc>
           <w:tcPr>
-            <w:tcW w:w="666" w:type="dxa"/>
+            <w:tcW w:w="810" w:type="dxa"/>
           </w:tcPr>
           <w:p>
             <w:pPr>
@@ -567,10 +670,11 @@
               <w:autoSpaceDE w:val="0"/>
               <w:autoSpaceDN w:val="0"/>
               <w:adjustRightInd w:val="0"/>
+              <w:spacing w:line="276" w:lineRule="auto"/>
               <w:jc w:val="center"/>
               <w:cnfStyle w:val="100000000000" w:firstRow="1" w:lastRow="0" w:firstColumn="0" w:lastColumn="0" w:oddVBand="0" w:evenVBand="0" w:oddHBand="0" w:evenHBand="0" w:firstRowFirstColumn="0" w:firstRowLastColumn="0" w:lastRowFirstColumn="0" w:lastRowLastColumn="0"/>
               <w:rPr>
-                <w:rFonts w:ascii="Arial" w:hAnsi="Arial" w:cs="Arial"/>
+                <w:rFonts w:cs="Calibri"/>
                 <w:color w:val="000000"/>
                 <w:sz w:val="20"/>
                 <w:szCs w:val="20"/>
@@ -578,10 +682,10 @@
             </w:pPr>
             <w:r>
               <w:rPr>
-                <w:rFonts w:ascii="Arial" w:hAnsi="Arial" w:cs="Arial"/>
-                <w:color w:val="000000"/>
-                <w:sz w:val="20"/>
-                <w:szCs w:val="20"/>
+                <w:rFonts w:cs="Calibri"/>
+                <w:color w:val="000000"/>
+                <w:sz w:val="16"/>
+                <w:szCs w:val="16"/>
               </w:rPr>
               <w:t>TPL</w:t>
             </w:r>
@@ -589,7 +693,7 @@
         </w:tc>
         <w:tc>
           <w:tcPr>
-            <w:tcW w:w="1592" w:type="dxa"/>
+            <w:tcW w:w="900" w:type="dxa"/>
           </w:tcPr>
           <w:p>
             <w:pPr>
@@ -597,29 +701,30 @@
               <w:autoSpaceDE w:val="0"/>
               <w:autoSpaceDN w:val="0"/>
               <w:adjustRightInd w:val="0"/>
+              <w:spacing w:line="276" w:lineRule="auto"/>
               <w:jc w:val="center"/>
               <w:cnfStyle w:val="100000000000" w:firstRow="1" w:lastRow="0" w:firstColumn="0" w:lastColumn="0" w:oddVBand="0" w:evenVBand="0" w:oddHBand="0" w:evenHBand="0" w:firstRowFirstColumn="0" w:firstRowLastColumn="0" w:lastRowFirstColumn="0" w:lastRowLastColumn="0"/>
               <w:rPr>
-                <w:rFonts w:ascii="Arial" w:hAnsi="Arial" w:cs="Arial"/>
-                <w:color w:val="000000"/>
-                <w:sz w:val="20"/>
-                <w:szCs w:val="20"/>
+                <w:rFonts w:cs="Calibri"/>
+                <w:color w:val="000000"/>
+                <w:sz w:val="16"/>
+                <w:szCs w:val="16"/>
               </w:rPr>
             </w:pPr>
             <w:r>
               <w:rPr>
-                <w:rFonts w:ascii="Arial" w:hAnsi="Arial" w:cs="Arial"/>
-                <w:color w:val="000000"/>
-                <w:sz w:val="20"/>
-                <w:szCs w:val="20"/>
-              </w:rPr>
-              <w:t>Guide</w:t>
+                <w:rFonts w:cs="Calibri"/>
+                <w:color w:val="000000"/>
+                <w:sz w:val="16"/>
+                <w:szCs w:val="16"/>
+              </w:rPr>
+              <w:t>Child</w:t>
             </w:r>
           </w:p>
         </w:tc>
         <w:tc>
           <w:tcPr>
-            <w:tcW w:w="1440" w:type="dxa"/>
+            <w:tcW w:w="1280" w:type="dxa"/>
           </w:tcPr>
           <w:p>
             <w:pPr>
@@ -627,10 +732,11 @@
               <w:autoSpaceDE w:val="0"/>
               <w:autoSpaceDN w:val="0"/>
               <w:adjustRightInd w:val="0"/>
+              <w:spacing w:line="276" w:lineRule="auto"/>
               <w:jc w:val="center"/>
               <w:cnfStyle w:val="100000000000" w:firstRow="1" w:lastRow="0" w:firstColumn="0" w:lastColumn="0" w:oddVBand="0" w:evenVBand="0" w:oddHBand="0" w:evenHBand="0" w:firstRowFirstColumn="0" w:firstRowLastColumn="0" w:lastRowFirstColumn="0" w:lastRowLastColumn="0"/>
               <w:rPr>
-                <w:rFonts w:ascii="Arial" w:hAnsi="Arial" w:cs="Arial"/>
+                <w:rFonts w:cs="Calibri"/>
                 <w:color w:val="000000"/>
                 <w:sz w:val="20"/>
                 <w:szCs w:val="20"/>
@@ -638,10 +744,41 @@
             </w:pPr>
             <w:r>
               <w:rPr>
-                <w:rFonts w:ascii="Arial" w:hAnsi="Arial" w:cs="Arial"/>
-                <w:color w:val="000000"/>
-                <w:sz w:val="20"/>
-                <w:szCs w:val="20"/>
+                <w:rFonts w:cs="Calibri"/>
+                <w:color w:val="000000"/>
+                <w:sz w:val="16"/>
+                <w:szCs w:val="16"/>
+              </w:rPr>
+              <w:t>Guide</w:t>
+            </w:r>
+          </w:p>
+        </w:tc>
+        <w:tc>
+          <w:tcPr>
+            <w:tcW w:w="1420" w:type="dxa"/>
+          </w:tcPr>
+          <w:p>
+            <w:pPr>
+              <w:widowControl w:val="0"/>
+              <w:autoSpaceDE w:val="0"/>
+              <w:autoSpaceDN w:val="0"/>
+              <w:adjustRightInd w:val="0"/>
+              <w:spacing w:line="276" w:lineRule="auto"/>
+              <w:jc w:val="center"/>
+              <w:cnfStyle w:val="100000000000" w:firstRow="1" w:lastRow="0" w:firstColumn="0" w:lastColumn="0" w:oddVBand="0" w:evenVBand="0" w:oddHBand="0" w:evenHBand="0" w:firstRowFirstColumn="0" w:firstRowLastColumn="0" w:lastRowFirstColumn="0" w:lastRowLastColumn="0"/>
+              <w:rPr>
+                <w:rFonts w:cs="Calibri"/>
+                <w:color w:val="000000"/>
+                <w:sz w:val="20"/>
+                <w:szCs w:val="20"/>
+              </w:rPr>
+            </w:pPr>
+            <w:r>
+              <w:rPr>
+                <w:rFonts w:cs="Calibri"/>
+                <w:color w:val="000000"/>
+                <w:sz w:val="16"/>
+                <w:szCs w:val="16"/>
               </w:rPr>
               <w:t>Arriving for</w:t>
             </w:r>
@@ -656,7 +793,7 @@
         <w:tc>
           <w:tcPr>
             <w:cnfStyle w:val="001000000000" w:firstRow="0" w:lastRow="0" w:firstColumn="1" w:lastColumn="0" w:oddVBand="0" w:evenVBand="0" w:oddHBand="0" w:evenHBand="0" w:firstRowFirstColumn="0" w:firstRowLastColumn="0" w:lastRowFirstColumn="0" w:lastRowLastColumn="0"/>
-            <w:tcW w:w="1715" w:type="dxa"/>
+            <w:tcW w:w="1885" w:type="dxa"/>
           </w:tcPr>
           <w:p>
             <w:pPr>
@@ -664,9 +801,10 @@
               <w:autoSpaceDE w:val="0"/>
               <w:autoSpaceDN w:val="0"/>
               <w:adjustRightInd w:val="0"/>
+              <w:spacing w:line="276" w:lineRule="auto"/>
               <w:jc w:val="center"/>
               <w:rPr>
-                <w:rFonts w:ascii="Arial" w:hAnsi="Arial" w:cs="Arial"/>
+                <w:rFonts w:cs="Calibri"/>
                 <w:b w:val="0"/>
                 <w:bCs w:val="0"/>
                 <w:color w:val="000000"/>
@@ -676,7 +814,7 @@
             </w:pPr>
             <w:r>
               <w:rPr>
-                <w:rFonts w:ascii="Arial" w:hAnsi="Arial" w:cs="Arial"/>
+                <w:rFonts w:cs="Calibri"/>
                 <w:b w:val="0"/>
                 <w:bCs w:val="0"/>
                 <w:color w:val="000000"/>
@@ -688,30 +826,19 @@
             <w:proofErr w:type="spellStart"/>
             <w:r>
               <w:rPr>
-                <w:rFonts w:ascii="Arial" w:hAnsi="Arial" w:cs="Arial"/>
+                <w:rFonts w:cs="Calibri"/>
                 <w:b w:val="0"/>
                 <w:bCs w:val="0"/>
                 <w:color w:val="000000"/>
                 <w:sz w:val="20"/>
                 <w:szCs w:val="20"/>
               </w:rPr>
-              <w:t>R</w:t>
-            </w:r>
-            <w:r>
-              <w:rPr>
-                <w:rFonts w:ascii="Arial" w:hAnsi="Arial" w:cs="Arial"/>
-                <w:b w:val="0"/>
-                <w:bCs w:val="0"/>
-                <w:color w:val="000000"/>
-                <w:sz w:val="20"/>
-                <w:szCs w:val="20"/>
-              </w:rPr>
-              <w:t>equiredDate</w:t>
+              <w:t>RequiredDate</w:t>
             </w:r>
             <w:proofErr w:type="spellEnd"/>
             <w:r>
               <w:rPr>
-                <w:rFonts w:ascii="Arial" w:hAnsi="Arial" w:cs="Arial"/>
+                <w:rFonts w:cs="Calibri"/>
                 <w:b w:val="0"/>
                 <w:bCs w:val="0"/>
                 <w:color w:val="000000"/>
@@ -724,7 +851,7 @@
         </w:tc>
         <w:tc>
           <w:tcPr>
-            <w:tcW w:w="1768" w:type="dxa"/>
+            <w:tcW w:w="1625" w:type="dxa"/>
           </w:tcPr>
           <w:p>
             <w:pPr>
@@ -732,10 +859,11 @@
               <w:autoSpaceDE w:val="0"/>
               <w:autoSpaceDN w:val="0"/>
               <w:adjustRightInd w:val="0"/>
+              <w:spacing w:line="276" w:lineRule="auto"/>
               <w:jc w:val="center"/>
               <w:cnfStyle w:val="000000100000" w:firstRow="0" w:lastRow="0" w:firstColumn="0" w:lastColumn="0" w:oddVBand="0" w:evenVBand="0" w:oddHBand="1" w:evenHBand="0" w:firstRowFirstColumn="0" w:firstRowLastColumn="0" w:lastRowFirstColumn="0" w:lastRowLastColumn="0"/>
               <w:rPr>
-                <w:rFonts w:ascii="Arial" w:hAnsi="Arial" w:cs="Arial"/>
+                <w:rFonts w:cs="Calibri"/>
                 <w:color w:val="000000"/>
                 <w:sz w:val="20"/>
                 <w:szCs w:val="20"/>
@@ -743,7 +871,7 @@
             </w:pPr>
             <w:r>
               <w:rPr>
-                <w:rFonts w:ascii="Arial" w:hAnsi="Arial" w:cs="Arial"/>
+                <w:rFonts w:cs="Calibri"/>
                 <w:color w:val="000000"/>
                 <w:sz w:val="20"/>
                 <w:szCs w:val="20"/>
@@ -753,7 +881,7 @@
             <w:proofErr w:type="spellStart"/>
             <w:r>
               <w:rPr>
-                <w:rFonts w:ascii="Arial" w:hAnsi="Arial" w:cs="Arial"/>
+                <w:rFonts w:cs="Calibri"/>
                 <w:color w:val="000000"/>
                 <w:sz w:val="20"/>
                 <w:szCs w:val="20"/>
@@ -762,17 +890,26 @@
             </w:r>
             <w:r>
               <w:rPr>
-                <w:rFonts w:ascii="Arial" w:hAnsi="Arial" w:cs="Arial"/>
-                <w:color w:val="000000"/>
-                <w:sz w:val="20"/>
-                <w:szCs w:val="20"/>
-              </w:rPr>
-              <w:t>oomCategory</w:t>
+                <w:rFonts w:cs="Calibri"/>
+                <w:color w:val="000000"/>
+                <w:sz w:val="20"/>
+                <w:szCs w:val="20"/>
+              </w:rPr>
+              <w:t>oomCategor</w:t>
+            </w:r>
+            <w:r>
+              <w:rPr>
+                <w:rFonts w:cs="Calibri"/>
+                <w:color w:val="000000"/>
+                <w:sz w:val="20"/>
+                <w:szCs w:val="20"/>
+              </w:rPr>
+              <w:t>y</w:t>
             </w:r>
             <w:proofErr w:type="spellEnd"/>
             <w:r>
               <w:rPr>
-                <w:rFonts w:ascii="Arial" w:hAnsi="Arial" w:cs="Arial"/>
+                <w:rFonts w:cs="Calibri"/>
                 <w:color w:val="000000"/>
                 <w:sz w:val="20"/>
                 <w:szCs w:val="20"/>
@@ -783,7 +920,7 @@
         </w:tc>
         <w:tc>
           <w:tcPr>
-            <w:tcW w:w="889" w:type="dxa"/>
+            <w:tcW w:w="985" w:type="dxa"/>
           </w:tcPr>
           <w:p>
             <w:pPr>
@@ -791,10 +928,11 @@
               <w:autoSpaceDE w:val="0"/>
               <w:autoSpaceDN w:val="0"/>
               <w:adjustRightInd w:val="0"/>
+              <w:spacing w:line="276" w:lineRule="auto"/>
               <w:jc w:val="center"/>
               <w:cnfStyle w:val="000000100000" w:firstRow="0" w:lastRow="0" w:firstColumn="0" w:lastColumn="0" w:oddVBand="0" w:evenVBand="0" w:oddHBand="1" w:evenHBand="0" w:firstRowFirstColumn="0" w:firstRowLastColumn="0" w:lastRowFirstColumn="0" w:lastRowLastColumn="0"/>
               <w:rPr>
-                <w:rFonts w:ascii="Arial" w:hAnsi="Arial" w:cs="Arial"/>
+                <w:rFonts w:cs="Calibri"/>
                 <w:color w:val="000000"/>
                 <w:sz w:val="20"/>
                 <w:szCs w:val="20"/>
@@ -802,7 +940,7 @@
             </w:pPr>
             <w:r>
               <w:rPr>
-                <w:rFonts w:ascii="Arial" w:hAnsi="Arial" w:cs="Arial"/>
+                <w:rFonts w:cs="Calibri"/>
                 <w:color w:val="000000"/>
                 <w:sz w:val="20"/>
                 <w:szCs w:val="20"/>
@@ -813,7 +951,7 @@
         </w:tc>
         <w:tc>
           <w:tcPr>
-            <w:tcW w:w="705" w:type="dxa"/>
+            <w:tcW w:w="900" w:type="dxa"/>
           </w:tcPr>
           <w:p>
             <w:pPr>
@@ -821,10 +959,11 @@
               <w:autoSpaceDE w:val="0"/>
               <w:autoSpaceDN w:val="0"/>
               <w:adjustRightInd w:val="0"/>
+              <w:spacing w:line="276" w:lineRule="auto"/>
               <w:jc w:val="center"/>
               <w:cnfStyle w:val="000000100000" w:firstRow="0" w:lastRow="0" w:firstColumn="0" w:lastColumn="0" w:oddVBand="0" w:evenVBand="0" w:oddHBand="1" w:evenHBand="0" w:firstRowFirstColumn="0" w:firstRowLastColumn="0" w:lastRowFirstColumn="0" w:lastRowLastColumn="0"/>
               <w:rPr>
-                <w:rFonts w:ascii="Arial" w:hAnsi="Arial" w:cs="Arial"/>
+                <w:rFonts w:cs="Calibri"/>
                 <w:color w:val="000000"/>
                 <w:sz w:val="20"/>
                 <w:szCs w:val="20"/>
@@ -832,7 +971,7 @@
             </w:pPr>
             <w:r>
               <w:rPr>
-                <w:rFonts w:ascii="Arial" w:hAnsi="Arial" w:cs="Arial"/>
+                <w:rFonts w:cs="Calibri"/>
                 <w:color w:val="000000"/>
                 <w:sz w:val="20"/>
                 <w:szCs w:val="20"/>
@@ -842,7 +981,7 @@
             <w:proofErr w:type="spellStart"/>
             <w:r>
               <w:rPr>
-                <w:rFonts w:ascii="Arial" w:hAnsi="Arial" w:cs="Arial"/>
+                <w:rFonts w:cs="Calibri"/>
                 <w:color w:val="000000"/>
                 <w:sz w:val="20"/>
                 <w:szCs w:val="20"/>
@@ -852,7 +991,7 @@
             <w:proofErr w:type="spellEnd"/>
             <w:r>
               <w:rPr>
-                <w:rFonts w:ascii="Arial" w:hAnsi="Arial" w:cs="Arial"/>
+                <w:rFonts w:cs="Calibri"/>
                 <w:color w:val="000000"/>
                 <w:sz w:val="20"/>
                 <w:szCs w:val="20"/>
@@ -863,7 +1002,7 @@
         </w:tc>
         <w:tc>
           <w:tcPr>
-            <w:tcW w:w="705" w:type="dxa"/>
+            <w:tcW w:w="900" w:type="dxa"/>
           </w:tcPr>
           <w:p>
             <w:pPr>
@@ -871,10 +1010,11 @@
               <w:autoSpaceDE w:val="0"/>
               <w:autoSpaceDN w:val="0"/>
               <w:adjustRightInd w:val="0"/>
+              <w:spacing w:line="276" w:lineRule="auto"/>
               <w:jc w:val="center"/>
               <w:cnfStyle w:val="000000100000" w:firstRow="0" w:lastRow="0" w:firstColumn="0" w:lastColumn="0" w:oddVBand="0" w:evenVBand="0" w:oddHBand="1" w:evenHBand="0" w:firstRowFirstColumn="0" w:firstRowLastColumn="0" w:lastRowFirstColumn="0" w:lastRowLastColumn="0"/>
               <w:rPr>
-                <w:rFonts w:ascii="Arial" w:hAnsi="Arial" w:cs="Arial"/>
+                <w:rFonts w:cs="Calibri"/>
                 <w:color w:val="000000"/>
                 <w:sz w:val="20"/>
                 <w:szCs w:val="20"/>
@@ -882,7 +1022,7 @@
             </w:pPr>
             <w:r>
               <w:rPr>
-                <w:rFonts w:ascii="Arial" w:hAnsi="Arial" w:cs="Arial"/>
+                <w:rFonts w:cs="Calibri"/>
                 <w:color w:val="000000"/>
                 <w:sz w:val="20"/>
                 <w:szCs w:val="20"/>
@@ -892,7 +1032,7 @@
             <w:proofErr w:type="spellStart"/>
             <w:r>
               <w:rPr>
-                <w:rFonts w:ascii="Arial" w:hAnsi="Arial" w:cs="Arial"/>
+                <w:rFonts w:cs="Calibri"/>
                 <w:color w:val="000000"/>
                 <w:sz w:val="20"/>
                 <w:szCs w:val="20"/>
@@ -902,7 +1042,7 @@
             <w:proofErr w:type="spellEnd"/>
             <w:r>
               <w:rPr>
-                <w:rFonts w:ascii="Arial" w:hAnsi="Arial" w:cs="Arial"/>
+                <w:rFonts w:cs="Calibri"/>
                 <w:color w:val="000000"/>
                 <w:sz w:val="20"/>
                 <w:szCs w:val="20"/>
@@ -913,7 +1053,7 @@
         </w:tc>
         <w:tc>
           <w:tcPr>
-            <w:tcW w:w="785" w:type="dxa"/>
+            <w:tcW w:w="810" w:type="dxa"/>
           </w:tcPr>
           <w:p>
             <w:pPr>
@@ -921,10 +1061,11 @@
               <w:autoSpaceDE w:val="0"/>
               <w:autoSpaceDN w:val="0"/>
               <w:adjustRightInd w:val="0"/>
+              <w:spacing w:line="276" w:lineRule="auto"/>
               <w:jc w:val="center"/>
               <w:cnfStyle w:val="000000100000" w:firstRow="0" w:lastRow="0" w:firstColumn="0" w:lastColumn="0" w:oddVBand="0" w:evenVBand="0" w:oddHBand="1" w:evenHBand="0" w:firstRowFirstColumn="0" w:firstRowLastColumn="0" w:lastRowFirstColumn="0" w:lastRowLastColumn="0"/>
               <w:rPr>
-                <w:rFonts w:ascii="Arial" w:hAnsi="Arial" w:cs="Arial"/>
+                <w:rFonts w:cs="Calibri"/>
                 <w:color w:val="000000"/>
                 <w:sz w:val="20"/>
                 <w:szCs w:val="20"/>
@@ -932,7 +1073,7 @@
             </w:pPr>
             <w:r>
               <w:rPr>
-                <w:rFonts w:ascii="Arial" w:hAnsi="Arial" w:cs="Arial"/>
+                <w:rFonts w:cs="Calibri"/>
                 <w:color w:val="000000"/>
                 <w:sz w:val="20"/>
                 <w:szCs w:val="20"/>
@@ -943,7 +1084,7 @@
         </w:tc>
         <w:tc>
           <w:tcPr>
-            <w:tcW w:w="666" w:type="dxa"/>
+            <w:tcW w:w="810" w:type="dxa"/>
           </w:tcPr>
           <w:p>
             <w:pPr>
@@ -951,10 +1092,11 @@
               <w:autoSpaceDE w:val="0"/>
               <w:autoSpaceDN w:val="0"/>
               <w:adjustRightInd w:val="0"/>
+              <w:spacing w:line="276" w:lineRule="auto"/>
               <w:jc w:val="center"/>
               <w:cnfStyle w:val="000000100000" w:firstRow="0" w:lastRow="0" w:firstColumn="0" w:lastColumn="0" w:oddVBand="0" w:evenVBand="0" w:oddHBand="1" w:evenHBand="0" w:firstRowFirstColumn="0" w:firstRowLastColumn="0" w:lastRowFirstColumn="0" w:lastRowLastColumn="0"/>
               <w:rPr>
-                <w:rFonts w:ascii="Arial" w:hAnsi="Arial" w:cs="Arial"/>
+                <w:rFonts w:cs="Calibri"/>
                 <w:color w:val="000000"/>
                 <w:sz w:val="20"/>
                 <w:szCs w:val="20"/>
@@ -962,7 +1104,7 @@
             </w:pPr>
             <w:r>
               <w:rPr>
-                <w:rFonts w:ascii="Arial" w:hAnsi="Arial" w:cs="Arial"/>
+                <w:rFonts w:cs="Calibri"/>
                 <w:color w:val="000000"/>
                 <w:sz w:val="20"/>
                 <w:szCs w:val="20"/>
@@ -972,26 +1114,17 @@
             <w:proofErr w:type="spellStart"/>
             <w:r>
               <w:rPr>
-                <w:rFonts w:ascii="Arial" w:hAnsi="Arial" w:cs="Arial"/>
-                <w:color w:val="000000"/>
-                <w:sz w:val="20"/>
-                <w:szCs w:val="20"/>
-              </w:rPr>
-              <w:t>t</w:t>
-            </w:r>
-            <w:r>
-              <w:rPr>
-                <w:rFonts w:ascii="Arial" w:hAnsi="Arial" w:cs="Arial"/>
-                <w:color w:val="000000"/>
-                <w:sz w:val="20"/>
-                <w:szCs w:val="20"/>
-              </w:rPr>
-              <w:t>pl</w:t>
+                <w:rFonts w:cs="Calibri"/>
+                <w:color w:val="000000"/>
+                <w:sz w:val="20"/>
+                <w:szCs w:val="20"/>
+              </w:rPr>
+              <w:t>tpl</w:t>
             </w:r>
             <w:proofErr w:type="spellEnd"/>
             <w:r>
               <w:rPr>
-                <w:rFonts w:ascii="Arial" w:hAnsi="Arial" w:cs="Arial"/>
+                <w:rFonts w:cs="Calibri"/>
                 <w:color w:val="000000"/>
                 <w:sz w:val="20"/>
                 <w:szCs w:val="20"/>
@@ -1002,7 +1135,7 @@
         </w:tc>
         <w:tc>
           <w:tcPr>
-            <w:tcW w:w="1592" w:type="dxa"/>
+            <w:tcW w:w="900" w:type="dxa"/>
           </w:tcPr>
           <w:p>
             <w:pPr>
@@ -1010,10 +1143,11 @@
               <w:autoSpaceDE w:val="0"/>
               <w:autoSpaceDN w:val="0"/>
               <w:adjustRightInd w:val="0"/>
+              <w:spacing w:line="276" w:lineRule="auto"/>
               <w:jc w:val="center"/>
               <w:cnfStyle w:val="000000100000" w:firstRow="0" w:lastRow="0" w:firstColumn="0" w:lastColumn="0" w:oddVBand="0" w:evenVBand="0" w:oddHBand="1" w:evenHBand="0" w:firstRowFirstColumn="0" w:firstRowLastColumn="0" w:lastRowFirstColumn="0" w:lastRowLastColumn="0"/>
               <w:rPr>
-                <w:rFonts w:ascii="Arial" w:hAnsi="Arial" w:cs="Arial"/>
+                <w:rFonts w:cs="Calibri"/>
                 <w:color w:val="000000"/>
                 <w:sz w:val="20"/>
                 <w:szCs w:val="20"/>
@@ -1021,7 +1155,38 @@
             </w:pPr>
             <w:r>
               <w:rPr>
-                <w:rFonts w:ascii="Arial" w:hAnsi="Arial" w:cs="Arial"/>
+                <w:rFonts w:cs="Calibri"/>
+                <w:color w:val="000000"/>
+                <w:sz w:val="20"/>
+                <w:szCs w:val="20"/>
+              </w:rPr>
+              <w:t>{child}</w:t>
+            </w:r>
+          </w:p>
+        </w:tc>
+        <w:tc>
+          <w:tcPr>
+            <w:tcW w:w="1280" w:type="dxa"/>
+          </w:tcPr>
+          <w:p>
+            <w:pPr>
+              <w:widowControl w:val="0"/>
+              <w:autoSpaceDE w:val="0"/>
+              <w:autoSpaceDN w:val="0"/>
+              <w:adjustRightInd w:val="0"/>
+              <w:spacing w:line="276" w:lineRule="auto"/>
+              <w:jc w:val="center"/>
+              <w:cnfStyle w:val="000000100000" w:firstRow="0" w:lastRow="0" w:firstColumn="0" w:lastColumn="0" w:oddVBand="0" w:evenVBand="0" w:oddHBand="1" w:evenHBand="0" w:firstRowFirstColumn="0" w:firstRowLastColumn="0" w:lastRowFirstColumn="0" w:lastRowLastColumn="0"/>
+              <w:rPr>
+                <w:rFonts w:cs="Calibri"/>
+                <w:color w:val="000000"/>
+                <w:sz w:val="20"/>
+                <w:szCs w:val="20"/>
+              </w:rPr>
+            </w:pPr>
+            <w:r>
+              <w:rPr>
+                <w:rFonts w:cs="Calibri"/>
                 <w:color w:val="000000"/>
                 <w:sz w:val="20"/>
                 <w:szCs w:val="20"/>
@@ -1030,7 +1195,7 @@
             </w:r>
             <w:r>
               <w:rPr>
-                <w:rFonts w:ascii="Arial" w:hAnsi="Arial" w:cs="Arial"/>
+                <w:rFonts w:cs="Calibri"/>
                 <w:color w:val="000000"/>
                 <w:sz w:val="20"/>
                 <w:szCs w:val="20"/>
@@ -1039,25 +1204,54 @@
             </w:r>
             <w:r>
               <w:rPr>
-                <w:rFonts w:ascii="Arial" w:hAnsi="Arial" w:cs="Arial"/>
-                <w:color w:val="000000"/>
-                <w:sz w:val="20"/>
-                <w:szCs w:val="20"/>
-              </w:rPr>
-              <w:t>uid</w:t>
+                <w:rFonts w:cs="Calibri"/>
+                <w:color w:val="000000"/>
+                <w:sz w:val="20"/>
+                <w:szCs w:val="20"/>
+              </w:rPr>
+              <w:t>uide</w:t>
             </w:r>
             <w:r>
               <w:rPr>
-                <w:rFonts w:ascii="Arial" w:hAnsi="Arial" w:cs="Arial"/>
-                <w:color w:val="000000"/>
-                <w:sz w:val="20"/>
-                <w:szCs w:val="20"/>
-              </w:rPr>
-              <w:t>e</w:t>
+                <w:rFonts w:cs="Calibri"/>
+                <w:color w:val="000000"/>
+                <w:sz w:val="20"/>
+                <w:szCs w:val="20"/>
+              </w:rPr>
+              <w:t>}</w:t>
             </w:r>
             <w:r>
               <w:rPr>
-                <w:rFonts w:ascii="Arial" w:hAnsi="Arial" w:cs="Arial"/>
+                <w:rFonts w:cs="Calibri"/>
+                <w:color w:val="000000"/>
+                <w:sz w:val="20"/>
+                <w:szCs w:val="20"/>
+              </w:rPr>
+              <w:t xml:space="preserve"> </w:t>
+            </w:r>
+            <w:r>
+              <w:rPr>
+                <w:rFonts w:cs="Calibri"/>
+                <w:color w:val="000000"/>
+                <w:sz w:val="20"/>
+                <w:szCs w:val="20"/>
+              </w:rPr>
+              <w:t>{</w:t>
+            </w:r>
+            <w:proofErr w:type="spellStart"/>
+            <w:r>
+              <w:rPr>
+                <w:rFonts w:cs="Calibri"/>
+                <w:color w:val="000000"/>
+                <w:sz w:val="20"/>
+                <w:szCs w:val="20"/>
+              </w:rPr>
+              <w:t>GuideBasis</w:t>
+            </w:r>
+            <w:proofErr w:type="spellEnd"/>
+            <w:r>
+              <w:rPr>
+                <w:rFonts w:cs="Calibri"/>
                 <w:color w:val="000000"/>
                 <w:sz w:val="20"/>
                 <w:szCs w:val="20"/>
@@ -1071,58 +1265,21 @@
               <w:autoSpaceDE w:val="0"/>
               <w:autoSpaceDN w:val="0"/>
               <w:adjustRightInd w:val="0"/>
+              <w:spacing w:line="276" w:lineRule="auto"/>
               <w:jc w:val="center"/>
               <w:cnfStyle w:val="000000100000" w:firstRow="0" w:lastRow="0" w:firstColumn="0" w:lastColumn="0" w:oddVBand="0" w:evenVBand="0" w:oddHBand="1" w:evenHBand="0" w:firstRowFirstColumn="0" w:firstRowLastColumn="0" w:lastRowFirstColumn="0" w:lastRowLastColumn="0"/>
               <w:rPr>
-                <w:rFonts w:ascii="Arial" w:hAnsi="Arial" w:cs="Arial"/>
+                <w:rFonts w:cs="Calibri"/>
                 <w:color w:val="000000"/>
                 <w:sz w:val="20"/>
                 <w:szCs w:val="20"/>
               </w:rPr>
             </w:pPr>
-            <w:r>
-              <w:rPr>
-                <w:rFonts w:ascii="Arial" w:hAnsi="Arial" w:cs="Arial"/>
-                <w:color w:val="000000"/>
-                <w:sz w:val="20"/>
-                <w:szCs w:val="20"/>
-              </w:rPr>
-              <w:t>{</w:t>
-            </w:r>
-            <w:proofErr w:type="spellStart"/>
-            <w:r>
-              <w:rPr>
-                <w:rFonts w:ascii="Arial" w:hAnsi="Arial" w:cs="Arial"/>
-                <w:color w:val="000000"/>
-                <w:sz w:val="20"/>
-                <w:szCs w:val="20"/>
-              </w:rPr>
-              <w:t>G</w:t>
-            </w:r>
-            <w:r>
-              <w:rPr>
-                <w:rFonts w:ascii="Arial" w:hAnsi="Arial" w:cs="Arial"/>
-                <w:color w:val="000000"/>
-                <w:sz w:val="20"/>
-                <w:szCs w:val="20"/>
-              </w:rPr>
-              <w:t>uideBasis</w:t>
-            </w:r>
-            <w:proofErr w:type="spellEnd"/>
-            <w:r>
-              <w:rPr>
-                <w:rFonts w:ascii="Arial" w:hAnsi="Arial" w:cs="Arial"/>
-                <w:color w:val="000000"/>
-                <w:sz w:val="20"/>
-                <w:szCs w:val="20"/>
-              </w:rPr>
-              <w:t>}</w:t>
-            </w:r>
           </w:p>
         </w:tc>
         <w:tc>
           <w:tcPr>
-            <w:tcW w:w="1440" w:type="dxa"/>
+            <w:tcW w:w="1420" w:type="dxa"/>
           </w:tcPr>
           <w:p>
             <w:pPr>
@@ -1130,10 +1287,11 @@
               <w:autoSpaceDE w:val="0"/>
               <w:autoSpaceDN w:val="0"/>
               <w:adjustRightInd w:val="0"/>
+              <w:spacing w:line="276" w:lineRule="auto"/>
               <w:jc w:val="center"/>
               <w:cnfStyle w:val="000000100000" w:firstRow="0" w:lastRow="0" w:firstColumn="0" w:lastColumn="0" w:oddVBand="0" w:evenVBand="0" w:oddHBand="1" w:evenHBand="0" w:firstRowFirstColumn="0" w:firstRowLastColumn="0" w:lastRowFirstColumn="0" w:lastRowLastColumn="0"/>
               <w:rPr>
-                <w:rFonts w:ascii="Arial" w:hAnsi="Arial" w:cs="Arial"/>
+                <w:rFonts w:cs="Calibri"/>
                 <w:color w:val="000000"/>
                 <w:sz w:val="20"/>
                 <w:szCs w:val="20"/>
@@ -1141,7 +1299,7 @@
             </w:pPr>
             <w:r>
               <w:rPr>
-                <w:rFonts w:ascii="Arial" w:hAnsi="Arial" w:cs="Arial"/>
+                <w:rFonts w:cs="Calibri"/>
                 <w:color w:val="000000"/>
                 <w:sz w:val="20"/>
                 <w:szCs w:val="20"/>
@@ -1151,7 +1309,7 @@
             <w:proofErr w:type="spellStart"/>
             <w:r>
               <w:rPr>
-                <w:rFonts w:ascii="Arial" w:hAnsi="Arial" w:cs="Arial"/>
+                <w:rFonts w:cs="Calibri"/>
                 <w:color w:val="000000"/>
                 <w:sz w:val="20"/>
                 <w:szCs w:val="20"/>
@@ -1160,35 +1318,17 @@
             </w:r>
             <w:r>
               <w:rPr>
-                <w:rFonts w:ascii="Arial" w:hAnsi="Arial" w:cs="Arial"/>
-                <w:color w:val="000000"/>
-                <w:sz w:val="20"/>
-                <w:szCs w:val="20"/>
-              </w:rPr>
-              <w:t>rriving</w:t>
-            </w:r>
-            <w:r>
-              <w:rPr>
-                <w:rFonts w:ascii="Arial" w:hAnsi="Arial" w:cs="Arial"/>
-                <w:color w:val="000000"/>
-                <w:sz w:val="20"/>
-                <w:szCs w:val="20"/>
-              </w:rPr>
-              <w:t>F</w:t>
-            </w:r>
-            <w:r>
-              <w:rPr>
-                <w:rFonts w:ascii="Arial" w:hAnsi="Arial" w:cs="Arial"/>
-                <w:color w:val="000000"/>
-                <w:sz w:val="20"/>
-                <w:szCs w:val="20"/>
-              </w:rPr>
-              <w:t>or</w:t>
+                <w:rFonts w:cs="Calibri"/>
+                <w:color w:val="000000"/>
+                <w:sz w:val="20"/>
+                <w:szCs w:val="20"/>
+              </w:rPr>
+              <w:t>rrivingFor</w:t>
             </w:r>
             <w:proofErr w:type="spellEnd"/>
             <w:r>
               <w:rPr>
-                <w:rFonts w:ascii="Arial" w:hAnsi="Arial" w:cs="Arial"/>
+                <w:rFonts w:cs="Calibri"/>
                 <w:color w:val="000000"/>
                 <w:sz w:val="20"/>
                 <w:szCs w:val="20"/>
@@ -1205,9 +1345,9 @@
         <w:autoSpaceDE w:val="0"/>
         <w:autoSpaceDN w:val="0"/>
         <w:adjustRightInd w:val="0"/>
-        <w:spacing w:after="0" w:line="240" w:lineRule="auto"/>
-        <w:rPr>
-          <w:rFonts w:ascii="Arial" w:hAnsi="Arial" w:cs="Arial"/>
+        <w:spacing w:after="0" w:line="276" w:lineRule="auto"/>
+        <w:rPr>
+          <w:rFonts w:cs="Calibri"/>
           <w:b/>
           <w:bCs/>
           <w:color w:val="000000"/>
@@ -1222,9 +1362,9 @@
         <w:autoSpaceDE w:val="0"/>
         <w:autoSpaceDN w:val="0"/>
         <w:adjustRightInd w:val="0"/>
-        <w:spacing w:after="0" w:line="240" w:lineRule="auto"/>
-        <w:rPr>
-          <w:rFonts w:ascii="Arial" w:hAnsi="Arial" w:cs="Arial"/>
+        <w:spacing w:after="0" w:line="276" w:lineRule="auto"/>
+        <w:rPr>
+          <w:rFonts w:cs="Calibri"/>
           <w:b/>
           <w:bCs/>
           <w:color w:val="000000"/>
@@ -1239,9 +1379,9 @@
         <w:autoSpaceDE w:val="0"/>
         <w:autoSpaceDN w:val="0"/>
         <w:adjustRightInd w:val="0"/>
-        <w:spacing w:after="0" w:line="240" w:lineRule="auto"/>
-        <w:rPr>
-          <w:rFonts w:ascii="Arial" w:hAnsi="Arial" w:cs="Arial"/>
+        <w:spacing w:after="0" w:line="276" w:lineRule="auto"/>
+        <w:rPr>
+          <w:rFonts w:cs="Calibri"/>
           <w:b/>
           <w:bCs/>
           <w:color w:val="000000"/>
@@ -1256,16 +1396,68 @@
         <w:autoSpaceDE w:val="0"/>
         <w:autoSpaceDN w:val="0"/>
         <w:adjustRightInd w:val="0"/>
-        <w:spacing w:after="0" w:line="240" w:lineRule="auto"/>
-        <w:rPr>
-          <w:rFonts w:ascii="Arial" w:hAnsi="Arial" w:cs="Arial"/>
+        <w:spacing w:after="0" w:line="276" w:lineRule="auto"/>
+        <w:rPr>
+          <w:rFonts w:cs="Calibri"/>
+          <w:bCs/>
+          <w:color w:val="000000"/>
+          <w:sz w:val="20"/>
+          <w:szCs w:val="20"/>
+        </w:rPr>
+      </w:pPr>
+      <w:r>
+        <w:rPr>
+          <w:rFonts w:cs="Calibri"/>
           <w:b/>
           <w:bCs/>
           <w:color w:val="000000"/>
           <w:sz w:val="20"/>
           <w:szCs w:val="20"/>
         </w:rPr>
-      </w:pPr>
+        <w:t xml:space="preserve">Confirmed </w:t>
+      </w:r>
+      <w:r>
+        <w:rPr>
+          <w:rFonts w:cs="Calibri"/>
+          <w:b/>
+          <w:bCs/>
+          <w:color w:val="000000"/>
+          <w:sz w:val="20"/>
+          <w:szCs w:val="20"/>
+        </w:rPr>
+        <w:t xml:space="preserve">By </w:t>
+      </w:r>
+      <w:r>
+        <w:rPr>
+          <w:rFonts w:cs="Calibri"/>
+          <w:b/>
+          <w:bCs/>
+          <w:color w:val="000000"/>
+          <w:sz w:val="20"/>
+          <w:szCs w:val="20"/>
+        </w:rPr>
+        <w:t>- {</w:t>
+      </w:r>
+      <w:proofErr w:type="spellStart"/>
+      <w:r>
+        <w:rPr>
+          <w:rFonts w:cs="Calibri"/>
+          <w:color w:val="000000"/>
+          <w:sz w:val="20"/>
+          <w:szCs w:val="20"/>
+        </w:rPr>
+        <w:t>confirmedBy</w:t>
+      </w:r>
+      <w:proofErr w:type="spellEnd"/>
+      <w:r>
+        <w:rPr>
+          <w:rFonts w:cs="Calibri"/>
+          <w:color w:val="000000"/>
+          <w:sz w:val="20"/>
+          <w:szCs w:val="20"/>
+        </w:rPr>
+        <w:t>}</w:t>
+      </w:r>
     </w:p>
     <w:p>
       <w:pPr>
@@ -1273,88 +1465,15 @@
         <w:autoSpaceDE w:val="0"/>
         <w:autoSpaceDN w:val="0"/>
         <w:adjustRightInd w:val="0"/>
-        <w:spacing w:after="0" w:line="240" w:lineRule="auto"/>
-        <w:rPr>
-          <w:rFonts w:ascii="Arial" w:hAnsi="Arial" w:cs="Arial"/>
+        <w:spacing w:after="0" w:line="276" w:lineRule="auto"/>
+        <w:rPr>
+          <w:rFonts w:cs="Calibri"/>
           <w:bCs/>
           <w:color w:val="000000"/>
           <w:sz w:val="20"/>
           <w:szCs w:val="20"/>
         </w:rPr>
       </w:pPr>
-      <w:r>
-        <w:rPr>
-          <w:rFonts w:ascii="Arial" w:hAnsi="Arial" w:cs="Arial"/>
-          <w:b/>
-          <w:bCs/>
-          <w:color w:val="000000"/>
-          <w:sz w:val="20"/>
-          <w:szCs w:val="20"/>
-        </w:rPr>
-        <w:t>Confirmed By</w:t>
-      </w:r>
-      <w:r>
-        <w:rPr>
-          <w:rFonts w:ascii="Arial" w:hAnsi="Arial" w:cs="Arial"/>
-          <w:b/>
-          <w:bCs/>
-          <w:color w:val="000000"/>
-          <w:sz w:val="20"/>
-          <w:szCs w:val="20"/>
-        </w:rPr>
-        <w:tab/>
-      </w:r>
-      <w:r>
-        <w:rPr>
-          <w:rFonts w:ascii="Arial" w:hAnsi="Arial" w:cs="Arial"/>
-          <w:b/>
-          <w:bCs/>
-          <w:color w:val="000000"/>
-          <w:sz w:val="20"/>
-          <w:szCs w:val="20"/>
-        </w:rPr>
-        <w:tab/>
-      </w:r>
-      <w:r>
-        <w:rPr>
-          <w:rFonts w:ascii="Arial" w:hAnsi="Arial" w:cs="Arial"/>
-          <w:b/>
-          <w:bCs/>
-          <w:color w:val="000000"/>
-          <w:sz w:val="20"/>
-          <w:szCs w:val="20"/>
-        </w:rPr>
-        <w:t xml:space="preserve">: </w:t>
-      </w:r>
-      <w:r>
-        <w:rPr>
-          <w:rFonts w:ascii="Arial" w:hAnsi="Arial" w:cs="Arial"/>
-          <w:color w:val="000000"/>
-          <w:sz w:val="20"/>
-          <w:szCs w:val="20"/>
-        </w:rPr>
-        <w:t>{</w:t>
-      </w:r>
-      <w:proofErr w:type="spellStart"/>
-      <w:r>
-        <w:rPr>
-          <w:rFonts w:ascii="Arial" w:hAnsi="Arial" w:cs="Arial"/>
-          <w:color w:val="000000"/>
-          <w:sz w:val="20"/>
-          <w:szCs w:val="20"/>
-        </w:rPr>
-        <w:t>confirmedBy</w:t>
-      </w:r>
-      <w:proofErr w:type="spellEnd"/>
-      <w:r>
-        <w:rPr>
-          <w:rFonts w:ascii="Arial" w:hAnsi="Arial" w:cs="Arial"/>
-          <w:color w:val="000000"/>
-          <w:sz w:val="20"/>
-          <w:szCs w:val="20"/>
-        </w:rPr>
-        <w:t>}</w:t>
-      </w:r>
     </w:p>
     <w:p>
       <w:pPr>
@@ -1362,15 +1481,49 @@
         <w:autoSpaceDE w:val="0"/>
         <w:autoSpaceDN w:val="0"/>
         <w:adjustRightInd w:val="0"/>
-        <w:spacing w:after="0" w:line="240" w:lineRule="auto"/>
-        <w:rPr>
-          <w:rFonts w:ascii="Arial" w:hAnsi="Arial" w:cs="Arial"/>
+        <w:spacing w:after="0" w:line="276" w:lineRule="auto"/>
+        <w:rPr>
+          <w:rFonts w:cs="Calibri"/>
+          <w:b/>
           <w:bCs/>
           <w:color w:val="000000"/>
           <w:sz w:val="20"/>
           <w:szCs w:val="20"/>
         </w:rPr>
       </w:pPr>
+      <w:r>
+        <w:rPr>
+          <w:rFonts w:cs="Calibri"/>
+          <w:b/>
+          <w:bCs/>
+          <w:color w:val="000000"/>
+          <w:sz w:val="20"/>
+          <w:szCs w:val="20"/>
+        </w:rPr>
+        <w:t xml:space="preserve">Rate </w:t>
+      </w:r>
+      <w:r>
+        <w:rPr>
+          <w:rFonts w:cs="Calibri"/>
+          <w:b/>
+          <w:bCs/>
+          <w:color w:val="000000"/>
+          <w:sz w:val="20"/>
+          <w:szCs w:val="20"/>
+        </w:rPr>
+        <w:t>Applicable</w:t>
+      </w:r>
+      <w:r>
+        <w:rPr>
+          <w:rFonts w:cs="Calibri"/>
+          <w:b/>
+          <w:bCs/>
+          <w:color w:val="000000"/>
+          <w:sz w:val="20"/>
+          <w:szCs w:val="20"/>
+        </w:rPr>
+        <w:t xml:space="preserve"> -</w:t>
+      </w:r>
     </w:p>
     <w:p>
       <w:pPr>
@@ -1378,9 +1531,10 @@
         <w:autoSpaceDE w:val="0"/>
         <w:autoSpaceDN w:val="0"/>
         <w:adjustRightInd w:val="0"/>
-        <w:spacing w:after="0" w:line="240" w:lineRule="auto"/>
-        <w:rPr>
-          <w:rFonts w:ascii="Arial" w:hAnsi="Arial" w:cs="Arial"/>
+        <w:spacing w:after="0" w:line="276" w:lineRule="auto"/>
+        <w:rPr>
+          <w:rFonts w:cs="Calibri"/>
+          <w:b/>
           <w:bCs/>
           <w:color w:val="000000"/>
           <w:sz w:val="20"/>
@@ -1394,15 +1548,54 @@
         <w:autoSpaceDE w:val="0"/>
         <w:autoSpaceDN w:val="0"/>
         <w:adjustRightInd w:val="0"/>
-        <w:spacing w:after="0" w:line="240" w:lineRule="auto"/>
-        <w:rPr>
-          <w:rFonts w:ascii="Arial" w:hAnsi="Arial" w:cs="Arial"/>
+        <w:spacing w:after="0" w:line="276" w:lineRule="auto"/>
+        <w:rPr>
+          <w:rFonts w:cs="Calibri"/>
           <w:bCs/>
           <w:color w:val="000000"/>
           <w:sz w:val="20"/>
           <w:szCs w:val="20"/>
         </w:rPr>
       </w:pPr>
+      <w:r>
+        <w:rPr>
+          <w:rFonts w:cs="Calibri"/>
+          <w:color w:val="000000"/>
+          <w:sz w:val="20"/>
+          <w:szCs w:val="20"/>
+        </w:rPr>
+        <w:t>{</w:t>
+      </w:r>
+      <w:proofErr w:type="spellStart"/>
+      <w:r>
+        <w:rPr>
+          <w:rFonts w:cs="Calibri"/>
+          <w:color w:val="000000"/>
+          <w:sz w:val="20"/>
+          <w:szCs w:val="20"/>
+        </w:rPr>
+        <w:t>r</w:t>
+      </w:r>
+      <w:r>
+        <w:rPr>
+          <w:rFonts w:cs="Calibri"/>
+          <w:color w:val="000000"/>
+          <w:sz w:val="20"/>
+          <w:szCs w:val="20"/>
+        </w:rPr>
+        <w:t>ateApplicable</w:t>
+      </w:r>
+      <w:proofErr w:type="spellEnd"/>
+      <w:r>
+        <w:rPr>
+          <w:rFonts w:cs="Calibri"/>
+          <w:bCs/>
+          <w:color w:val="000000"/>
+          <w:sz w:val="20"/>
+          <w:szCs w:val="20"/>
+        </w:rPr>
+        <w:t>}</w:t>
+      </w:r>
     </w:p>
     <w:p>
       <w:pPr>
@@ -1410,97 +1603,16 @@
         <w:autoSpaceDE w:val="0"/>
         <w:autoSpaceDN w:val="0"/>
         <w:adjustRightInd w:val="0"/>
-        <w:spacing w:after="0" w:line="240" w:lineRule="auto"/>
-        <w:rPr>
-          <w:rFonts w:ascii="Arial" w:hAnsi="Arial" w:cs="Arial"/>
-          <w:bCs/>
-          <w:color w:val="000000"/>
-          <w:sz w:val="20"/>
-          <w:szCs w:val="20"/>
-        </w:rPr>
-      </w:pPr>
-      <w:r>
-        <w:rPr>
-          <w:rFonts w:ascii="Arial" w:hAnsi="Arial" w:cs="Arial"/>
+        <w:spacing w:after="0" w:line="276" w:lineRule="auto"/>
+        <w:rPr>
+          <w:rFonts w:cs="Calibri"/>
           <w:b/>
           <w:bCs/>
           <w:color w:val="000000"/>
           <w:sz w:val="20"/>
           <w:szCs w:val="20"/>
         </w:rPr>
-        <w:t>Rate Applicable</w:t>
-      </w:r>
-      <w:r>
-        <w:rPr>
-          <w:rFonts w:ascii="Arial" w:hAnsi="Arial" w:cs="Arial"/>
-          <w:b/>
-          <w:bCs/>
-          <w:color w:val="000000"/>
-          <w:sz w:val="20"/>
-          <w:szCs w:val="20"/>
-        </w:rPr>
-        <w:tab/>
-      </w:r>
-      <w:r>
-        <w:rPr>
-          <w:rFonts w:ascii="Arial" w:hAnsi="Arial" w:cs="Arial"/>
-          <w:b/>
-          <w:bCs/>
-          <w:color w:val="000000"/>
-          <w:sz w:val="20"/>
-          <w:szCs w:val="20"/>
-        </w:rPr>
-        <w:t xml:space="preserve">: </w:t>
-      </w:r>
-      <w:r>
-        <w:rPr>
-          <w:rFonts w:ascii="Arial" w:hAnsi="Arial" w:cs="Arial"/>
-          <w:color w:val="000000"/>
-          <w:sz w:val="20"/>
-          <w:szCs w:val="20"/>
-        </w:rPr>
-        <w:t>{</w:t>
-      </w:r>
-      <w:proofErr w:type="spellStart"/>
-      <w:r>
-        <w:rPr>
-          <w:rFonts w:ascii="Arial" w:hAnsi="Arial" w:cs="Arial"/>
-          <w:color w:val="000000"/>
-          <w:sz w:val="20"/>
-          <w:szCs w:val="20"/>
-        </w:rPr>
-        <w:t>r</w:t>
-      </w:r>
-      <w:r>
-        <w:rPr>
-          <w:rFonts w:ascii="Arial" w:hAnsi="Arial" w:cs="Arial"/>
-          <w:color w:val="000000"/>
-          <w:sz w:val="20"/>
-          <w:szCs w:val="20"/>
-        </w:rPr>
-        <w:t>ateApplicable</w:t>
-      </w:r>
-      <w:proofErr w:type="spellEnd"/>
-      <w:r>
-        <w:rPr>
-          <w:rFonts w:ascii="Arial" w:hAnsi="Arial" w:cs="Arial"/>
-          <w:bCs/>
-          <w:color w:val="000000"/>
-          <w:sz w:val="20"/>
-          <w:szCs w:val="20"/>
-        </w:rPr>
-        <w:t>}</w:t>
-      </w:r>
-      <w:r>
-        <w:rPr>
-          <w:rFonts w:ascii="Arial" w:hAnsi="Arial" w:cs="Arial"/>
-          <w:bCs/>
-          <w:color w:val="000000"/>
-          <w:sz w:val="20"/>
-          <w:szCs w:val="20"/>
-        </w:rPr>
-        <w:t xml:space="preserve"> </w:t>
-      </w:r>
+      </w:pPr>
     </w:p>
     <w:p>
       <w:pPr>
@@ -1508,9 +1620,10 @@
         <w:autoSpaceDE w:val="0"/>
         <w:autoSpaceDN w:val="0"/>
         <w:adjustRightInd w:val="0"/>
-        <w:spacing w:after="0" w:line="240" w:lineRule="auto"/>
-        <w:rPr>
-          <w:rFonts w:ascii="Arial" w:hAnsi="Arial" w:cs="Arial"/>
+        <w:spacing w:after="0" w:line="276" w:lineRule="auto"/>
+        <w:rPr>
+          <w:rFonts w:cs="Calibri"/>
+          <w:b/>
           <w:bCs/>
           <w:color w:val="000000"/>
           <w:sz w:val="20"/>
@@ -1519,91 +1632,36 @@
       </w:pPr>
       <w:r>
         <w:rPr>
-          <w:rFonts w:ascii="Arial" w:hAnsi="Arial" w:cs="Arial"/>
+          <w:rFonts w:cs="Calibri"/>
+          <w:b/>
           <w:bCs/>
           <w:color w:val="000000"/>
           <w:sz w:val="20"/>
           <w:szCs w:val="20"/>
         </w:rPr>
+        <w:t>Remarks</w:t>
+      </w:r>
+      <w:r>
+        <w:rPr>
+          <w:rFonts w:cs="Calibri"/>
+          <w:b/>
+          <w:bCs/>
+          <w:color w:val="000000"/>
+          <w:sz w:val="20"/>
+          <w:szCs w:val="20"/>
+        </w:rPr>
+        <w:t xml:space="preserve"> - </w:t>
+      </w:r>
+      <w:r>
+        <w:rPr>
+          <w:rFonts w:cs="Calibri"/>
+          <w:b/>
+          <w:bCs/>
+          <w:color w:val="000000"/>
+          <w:sz w:val="20"/>
+          <w:szCs w:val="20"/>
+        </w:rPr>
         <w:tab/>
-      </w:r>
-      <w:r>
-        <w:rPr>
-          <w:rFonts w:ascii="Arial" w:hAnsi="Arial" w:cs="Arial"/>
-          <w:bCs/>
-          <w:color w:val="000000"/>
-          <w:sz w:val="20"/>
-          <w:szCs w:val="20"/>
-        </w:rPr>
-        <w:tab/>
-      </w:r>
-      <w:r>
-        <w:rPr>
-          <w:rFonts w:ascii="Arial" w:hAnsi="Arial" w:cs="Arial"/>
-          <w:bCs/>
-          <w:color w:val="000000"/>
-          <w:sz w:val="20"/>
-          <w:szCs w:val="20"/>
-        </w:rPr>
-        <w:tab/>
-        <w:t xml:space="preserve">  {</w:t>
-      </w:r>
-      <w:proofErr w:type="spellStart"/>
-      <w:r>
-        <w:rPr>
-          <w:rFonts w:ascii="Arial" w:hAnsi="Arial" w:cs="Arial"/>
-          <w:color w:val="000000"/>
-          <w:sz w:val="20"/>
-          <w:szCs w:val="20"/>
-        </w:rPr>
-        <w:t>g</w:t>
-      </w:r>
-      <w:r>
-        <w:rPr>
-          <w:rFonts w:ascii="Arial" w:hAnsi="Arial" w:cs="Arial"/>
-          <w:color w:val="000000"/>
-          <w:sz w:val="20"/>
-          <w:szCs w:val="20"/>
-        </w:rPr>
-        <w:t>uide</w:t>
-      </w:r>
-      <w:r>
-        <w:rPr>
-          <w:rFonts w:ascii="Arial" w:hAnsi="Arial" w:cs="Arial"/>
-          <w:color w:val="000000"/>
-          <w:sz w:val="20"/>
-          <w:szCs w:val="20"/>
-        </w:rPr>
-        <w:t>or</w:t>
-      </w:r>
-      <w:r>
-        <w:rPr>
-          <w:rFonts w:ascii="Arial" w:hAnsi="Arial" w:cs="Arial"/>
-          <w:color w:val="000000"/>
-          <w:sz w:val="20"/>
-          <w:szCs w:val="20"/>
-        </w:rPr>
-        <w:t>D</w:t>
-      </w:r>
-      <w:r>
-        <w:rPr>
-          <w:rFonts w:ascii="Arial" w:hAnsi="Arial" w:cs="Arial"/>
-          <w:color w:val="000000"/>
-          <w:sz w:val="20"/>
-          <w:szCs w:val="20"/>
-        </w:rPr>
-        <w:t>river</w:t>
-      </w:r>
-      <w:proofErr w:type="spellEnd"/>
-      <w:r>
-        <w:rPr>
-          <w:rFonts w:ascii="Arial" w:hAnsi="Arial" w:cs="Arial"/>
-          <w:bCs/>
-          <w:color w:val="000000"/>
-          <w:sz w:val="20"/>
-          <w:szCs w:val="20"/>
-        </w:rPr>
-        <w:t>}</w:t>
       </w:r>
     </w:p>
     <w:p>
@@ -1612,9 +1670,9 @@
         <w:autoSpaceDE w:val="0"/>
         <w:autoSpaceDN w:val="0"/>
         <w:adjustRightInd w:val="0"/>
-        <w:spacing w:after="0" w:line="240" w:lineRule="auto"/>
-        <w:rPr>
-          <w:rFonts w:ascii="Arial" w:hAnsi="Arial" w:cs="Arial"/>
+        <w:spacing w:after="0" w:line="276" w:lineRule="auto"/>
+        <w:rPr>
+          <w:rFonts w:cs="Calibri"/>
           <w:b/>
           <w:bCs/>
           <w:color w:val="000000"/>
@@ -1622,6 +1680,28 @@
           <w:szCs w:val="20"/>
         </w:rPr>
       </w:pPr>
+      <w:r>
+        <w:rPr>
+          <w:rFonts w:cs="Calibri"/>
+          <w:b/>
+          <w:bCs/>
+          <w:color w:val="000000"/>
+          <w:sz w:val="20"/>
+          <w:szCs w:val="20"/>
+        </w:rPr>
+        <w:tab/>
+      </w:r>
+      <w:r>
+        <w:rPr>
+          <w:rFonts w:cs="Calibri"/>
+          <w:b/>
+          <w:bCs/>
+          <w:color w:val="000000"/>
+          <w:sz w:val="20"/>
+          <w:szCs w:val="20"/>
+        </w:rPr>
+        <w:t xml:space="preserve"> </w:t>
+      </w:r>
     </w:p>
     <w:p>
       <w:pPr>
@@ -1629,9 +1709,9 @@
         <w:autoSpaceDE w:val="0"/>
         <w:autoSpaceDN w:val="0"/>
         <w:adjustRightInd w:val="0"/>
-        <w:spacing w:after="0" w:line="240" w:lineRule="auto"/>
-        <w:rPr>
-          <w:rFonts w:ascii="Arial" w:hAnsi="Arial" w:cs="Arial"/>
+        <w:spacing w:after="0" w:line="276" w:lineRule="auto"/>
+        <w:rPr>
+          <w:rFonts w:cs="Calibri"/>
           <w:b/>
           <w:bCs/>
           <w:color w:val="000000"/>
@@ -1639,6 +1719,35 @@
           <w:szCs w:val="20"/>
         </w:rPr>
       </w:pPr>
+      <w:r>
+        <w:rPr>
+          <w:rFonts w:cs="Calibri"/>
+          <w:color w:val="000000"/>
+          <w:sz w:val="20"/>
+          <w:szCs w:val="20"/>
+        </w:rPr>
+        <w:t>{</w:t>
+      </w:r>
+      <w:proofErr w:type="spellStart"/>
+      <w:r>
+        <w:rPr>
+          <w:rFonts w:cs="Calibri"/>
+          <w:color w:val="000000"/>
+          <w:sz w:val="20"/>
+          <w:szCs w:val="20"/>
+        </w:rPr>
+        <w:t>reamrks</w:t>
+      </w:r>
+      <w:proofErr w:type="spellEnd"/>
+      <w:r>
+        <w:rPr>
+          <w:rFonts w:cs="Calibri"/>
+          <w:color w:val="000000"/>
+          <w:sz w:val="20"/>
+          <w:szCs w:val="20"/>
+        </w:rPr>
+        <w:t>}</w:t>
+      </w:r>
     </w:p>
     <w:p>
       <w:pPr>
@@ -1646,9 +1755,9 @@
         <w:autoSpaceDE w:val="0"/>
         <w:autoSpaceDN w:val="0"/>
         <w:adjustRightInd w:val="0"/>
-        <w:spacing w:after="0" w:line="240" w:lineRule="auto"/>
-        <w:rPr>
-          <w:rFonts w:ascii="Arial" w:hAnsi="Arial" w:cs="Arial"/>
+        <w:spacing w:after="0" w:line="276" w:lineRule="auto"/>
+        <w:rPr>
+          <w:rFonts w:cs="Calibri"/>
           <w:b/>
           <w:bCs/>
           <w:color w:val="000000"/>
@@ -1663,87 +1772,48 @@
         <w:autoSpaceDE w:val="0"/>
         <w:autoSpaceDN w:val="0"/>
         <w:adjustRightInd w:val="0"/>
-        <w:spacing w:after="0" w:line="240" w:lineRule="auto"/>
-        <w:rPr>
-          <w:rFonts w:ascii="Arial" w:hAnsi="Arial" w:cs="Arial"/>
-          <w:bCs/>
-          <w:color w:val="000000"/>
-          <w:sz w:val="20"/>
-          <w:szCs w:val="20"/>
-        </w:rPr>
-      </w:pPr>
-      <w:r>
-        <w:rPr>
-          <w:rFonts w:ascii="Arial" w:hAnsi="Arial" w:cs="Arial"/>
+        <w:spacing w:after="0" w:line="276" w:lineRule="auto"/>
+        <w:rPr>
+          <w:rFonts w:cs="Calibri"/>
           <w:b/>
           <w:bCs/>
           <w:color w:val="000000"/>
           <w:sz w:val="20"/>
           <w:szCs w:val="20"/>
         </w:rPr>
-        <w:t>Remarks</w:t>
-      </w:r>
-      <w:r>
-        <w:rPr>
-          <w:rFonts w:ascii="Arial" w:hAnsi="Arial" w:cs="Arial"/>
+      </w:pPr>
+      <w:r>
+        <w:rPr>
+          <w:rFonts w:cs="Calibri"/>
           <w:b/>
           <w:bCs/>
           <w:color w:val="000000"/>
           <w:sz w:val="20"/>
           <w:szCs w:val="20"/>
         </w:rPr>
-        <w:tab/>
-      </w:r>
-      <w:r>
-        <w:rPr>
-          <w:rFonts w:ascii="Arial" w:hAnsi="Arial" w:cs="Arial"/>
+        <w:t xml:space="preserve">Billing </w:t>
+      </w:r>
+      <w:r>
+        <w:rPr>
+          <w:rFonts w:cs="Calibri"/>
           <w:b/>
           <w:bCs/>
           <w:color w:val="000000"/>
           <w:sz w:val="20"/>
           <w:szCs w:val="20"/>
         </w:rPr>
-        <w:tab/>
-      </w:r>
-      <w:r>
-        <w:rPr>
-          <w:rFonts w:ascii="Arial" w:hAnsi="Arial" w:cs="Arial"/>
+        <w:t>Instruction</w:t>
+      </w:r>
+      <w:r>
+        <w:rPr>
+          <w:rFonts w:cs="Calibri"/>
           <w:b/>
           <w:bCs/>
           <w:color w:val="000000"/>
           <w:sz w:val="20"/>
           <w:szCs w:val="20"/>
         </w:rPr>
-        <w:t xml:space="preserve">: </w:t>
-      </w:r>
-      <w:r>
-        <w:rPr>
-          <w:rFonts w:ascii="Arial" w:hAnsi="Arial" w:cs="Arial"/>
-          <w:color w:val="000000"/>
-          <w:sz w:val="20"/>
-          <w:szCs w:val="20"/>
-        </w:rPr>
-        <w:t>{</w:t>
-      </w:r>
-      <w:proofErr w:type="spellStart"/>
-      <w:r>
-        <w:rPr>
-          <w:rFonts w:ascii="Arial" w:hAnsi="Arial" w:cs="Arial"/>
-          <w:color w:val="000000"/>
-          <w:sz w:val="20"/>
-          <w:szCs w:val="20"/>
-        </w:rPr>
-        <w:t>reamrks</w:t>
-      </w:r>
-      <w:proofErr w:type="spellEnd"/>
-      <w:r>
-        <w:rPr>
-          <w:rFonts w:ascii="Arial" w:hAnsi="Arial" w:cs="Arial"/>
-          <w:color w:val="000000"/>
-          <w:sz w:val="20"/>
-          <w:szCs w:val="20"/>
-        </w:rPr>
-        <w:t>}</w:t>
+        <w:t xml:space="preserve"> - </w:t>
       </w:r>
     </w:p>
     <w:p>
@@ -1752,10 +1822,9 @@
         <w:autoSpaceDE w:val="0"/>
         <w:autoSpaceDN w:val="0"/>
         <w:adjustRightInd w:val="0"/>
-        <w:spacing w:after="0" w:line="240" w:lineRule="auto"/>
-        <w:rPr>
-          <w:rFonts w:ascii="Arial" w:hAnsi="Arial" w:cs="Arial"/>
-          <w:b/>
+        <w:spacing w:after="0" w:line="276" w:lineRule="auto"/>
+        <w:rPr>
+          <w:rFonts w:cs="Calibri"/>
           <w:bCs/>
           <w:color w:val="000000"/>
           <w:sz w:val="20"/>
@@ -1769,107 +1838,18 @@
         <w:autoSpaceDE w:val="0"/>
         <w:autoSpaceDN w:val="0"/>
         <w:adjustRightInd w:val="0"/>
-        <w:spacing w:after="0" w:line="240" w:lineRule="auto"/>
-        <w:rPr>
-          <w:rFonts w:ascii="Arial" w:hAnsi="Arial" w:cs="Arial"/>
-          <w:b/>
+        <w:spacing w:after="0" w:line="276" w:lineRule="auto"/>
+        <w:rPr>
+          <w:rFonts w:cs="Calibri"/>
           <w:bCs/>
           <w:color w:val="000000"/>
           <w:sz w:val="20"/>
           <w:szCs w:val="20"/>
         </w:rPr>
       </w:pPr>
-    </w:p>
-    <w:p>
-      <w:pPr>
-        <w:widowControl w:val="0"/>
-        <w:autoSpaceDE w:val="0"/>
-        <w:autoSpaceDN w:val="0"/>
-        <w:adjustRightInd w:val="0"/>
-        <w:spacing w:after="0" w:line="240" w:lineRule="auto"/>
-        <w:rPr>
-          <w:rFonts w:ascii="Arial" w:hAnsi="Arial" w:cs="Arial"/>
-          <w:b/>
-          <w:bCs/>
-          <w:color w:val="000000"/>
-          <w:sz w:val="20"/>
-          <w:szCs w:val="20"/>
-        </w:rPr>
-      </w:pPr>
-    </w:p>
-    <w:p>
-      <w:pPr>
-        <w:widowControl w:val="0"/>
-        <w:autoSpaceDE w:val="0"/>
-        <w:autoSpaceDN w:val="0"/>
-        <w:adjustRightInd w:val="0"/>
-        <w:spacing w:after="0" w:line="240" w:lineRule="auto"/>
-        <w:rPr>
-          <w:rFonts w:ascii="Arial" w:hAnsi="Arial" w:cs="Arial"/>
-          <w:b/>
-          <w:bCs/>
-          <w:color w:val="000000"/>
-          <w:sz w:val="20"/>
-          <w:szCs w:val="20"/>
-        </w:rPr>
-      </w:pPr>
-      <w:r>
-        <w:rPr>
-          <w:rFonts w:ascii="Arial" w:hAnsi="Arial" w:cs="Arial"/>
-          <w:b/>
-          <w:bCs/>
-          <w:color w:val="000000"/>
-          <w:sz w:val="20"/>
-          <w:szCs w:val="20"/>
-        </w:rPr>
-        <w:t>Billing Instruction</w:t>
-      </w:r>
-      <w:r>
-        <w:rPr>
-          <w:rFonts w:ascii="Arial" w:hAnsi="Arial" w:cs="Arial"/>
-          <w:b/>
-          <w:bCs/>
-          <w:color w:val="000000"/>
-          <w:sz w:val="20"/>
-          <w:szCs w:val="20"/>
-        </w:rPr>
-        <w:t xml:space="preserve"> – </w:t>
-      </w:r>
-    </w:p>
-    <w:p>
-      <w:pPr>
-        <w:widowControl w:val="0"/>
-        <w:autoSpaceDE w:val="0"/>
-        <w:autoSpaceDN w:val="0"/>
-        <w:adjustRightInd w:val="0"/>
-        <w:spacing w:after="0" w:line="240" w:lineRule="auto"/>
-        <w:rPr>
-          <w:rFonts w:ascii="Arial" w:hAnsi="Arial" w:cs="Arial"/>
-          <w:bCs/>
-          <w:color w:val="000000"/>
-          <w:sz w:val="20"/>
-          <w:szCs w:val="20"/>
-        </w:rPr>
-      </w:pPr>
-    </w:p>
-    <w:p>
-      <w:pPr>
-        <w:widowControl w:val="0"/>
-        <w:autoSpaceDE w:val="0"/>
-        <w:autoSpaceDN w:val="0"/>
-        <w:adjustRightInd w:val="0"/>
-        <w:spacing w:after="0" w:line="240" w:lineRule="auto"/>
-        <w:rPr>
-          <w:rFonts w:ascii="Arial" w:hAnsi="Arial" w:cs="Arial"/>
-          <w:bCs/>
-          <w:color w:val="000000"/>
-          <w:sz w:val="20"/>
-          <w:szCs w:val="20"/>
-        </w:rPr>
-      </w:pPr>
-      <w:r>
-        <w:rPr>
-          <w:rFonts w:ascii="Arial" w:hAnsi="Arial" w:cs="Arial"/>
+      <w:r>
+        <w:rPr>
+          <w:rFonts w:cs="Calibri"/>
           <w:color w:val="000000"/>
           <w:sz w:val="20"/>
           <w:szCs w:val="20"/>
@@ -1879,7 +1859,7 @@
       <w:proofErr w:type="spellStart"/>
       <w:r>
         <w:rPr>
-          <w:rFonts w:ascii="Arial" w:hAnsi="Arial" w:cs="Arial"/>
+          <w:rFonts w:cs="Calibri"/>
           <w:color w:val="000000"/>
           <w:sz w:val="20"/>
           <w:szCs w:val="20"/>
@@ -1889,385 +1869,17 @@
       <w:proofErr w:type="spellEnd"/>
       <w:r>
         <w:rPr>
-          <w:rFonts w:ascii="Arial" w:hAnsi="Arial" w:cs="Arial"/>
+          <w:rFonts w:cs="Calibri"/>
           <w:color w:val="000000"/>
           <w:sz w:val="20"/>
           <w:szCs w:val="20"/>
         </w:rPr>
         <w:t>}</w:t>
-      </w:r>
-    </w:p>
-    <w:p>
-      <w:pPr>
-        <w:widowControl w:val="0"/>
-        <w:autoSpaceDE w:val="0"/>
-        <w:autoSpaceDN w:val="0"/>
-        <w:adjustRightInd w:val="0"/>
-        <w:spacing w:after="0" w:line="240" w:lineRule="auto"/>
-        <w:rPr>
-          <w:rFonts w:ascii="Arial" w:hAnsi="Arial" w:cs="Arial"/>
-          <w:color w:val="000000"/>
-          <w:sz w:val="20"/>
-          <w:szCs w:val="20"/>
-        </w:rPr>
-      </w:pPr>
-    </w:p>
-    <w:p>
-      <w:pPr>
-        <w:widowControl w:val="0"/>
-        <w:autoSpaceDE w:val="0"/>
-        <w:autoSpaceDN w:val="0"/>
-        <w:adjustRightInd w:val="0"/>
-        <w:spacing w:after="0" w:line="240" w:lineRule="auto"/>
-        <w:rPr>
-          <w:rFonts w:ascii="Arial" w:hAnsi="Arial" w:cs="Arial"/>
-          <w:color w:val="000000"/>
-          <w:sz w:val="20"/>
-          <w:szCs w:val="20"/>
-        </w:rPr>
-      </w:pPr>
-    </w:p>
-    <w:p>
-      <w:pPr>
-        <w:widowControl w:val="0"/>
-        <w:autoSpaceDE w:val="0"/>
-        <w:autoSpaceDN w:val="0"/>
-        <w:adjustRightInd w:val="0"/>
-        <w:spacing w:after="0" w:line="240" w:lineRule="auto"/>
-        <w:rPr>
-          <w:rFonts w:ascii="Arial" w:hAnsi="Arial" w:cs="Arial"/>
-          <w:color w:val="000000"/>
-          <w:sz w:val="20"/>
-          <w:szCs w:val="20"/>
-        </w:rPr>
-      </w:pPr>
-    </w:p>
-    <w:p>
-      <w:pPr>
-        <w:widowControl w:val="0"/>
-        <w:autoSpaceDE w:val="0"/>
-        <w:autoSpaceDN w:val="0"/>
-        <w:adjustRightInd w:val="0"/>
-        <w:spacing w:after="0" w:line="240" w:lineRule="auto"/>
-        <w:rPr>
-          <w:rFonts w:ascii="Arial" w:hAnsi="Arial" w:cs="Arial"/>
-          <w:color w:val="000000"/>
-          <w:sz w:val="20"/>
-          <w:szCs w:val="20"/>
-        </w:rPr>
-      </w:pPr>
-    </w:p>
-    <w:p>
-      <w:pPr>
-        <w:widowControl w:val="0"/>
-        <w:autoSpaceDE w:val="0"/>
-        <w:autoSpaceDN w:val="0"/>
-        <w:adjustRightInd w:val="0"/>
-        <w:spacing w:after="0" w:line="240" w:lineRule="auto"/>
-        <w:rPr>
-          <w:rFonts w:ascii="Arial" w:hAnsi="Arial" w:cs="Arial"/>
-          <w:color w:val="000000"/>
-          <w:sz w:val="20"/>
-          <w:szCs w:val="20"/>
-        </w:rPr>
-      </w:pPr>
-    </w:p>
-    <w:p>
-      <w:pPr>
-        <w:widowControl w:val="0"/>
-        <w:autoSpaceDE w:val="0"/>
-        <w:autoSpaceDN w:val="0"/>
-        <w:adjustRightInd w:val="0"/>
-        <w:spacing w:after="0" w:line="240" w:lineRule="auto"/>
-        <w:rPr>
-          <w:rFonts w:ascii="Arial" w:hAnsi="Arial" w:cs="Arial"/>
-          <w:color w:val="000000"/>
-          <w:sz w:val="20"/>
-          <w:szCs w:val="20"/>
-        </w:rPr>
-      </w:pPr>
-    </w:p>
-    <w:p>
-      <w:pPr>
-        <w:widowControl w:val="0"/>
-        <w:autoSpaceDE w:val="0"/>
-        <w:autoSpaceDN w:val="0"/>
-        <w:adjustRightInd w:val="0"/>
-        <w:spacing w:after="0" w:line="240" w:lineRule="auto"/>
-        <w:rPr>
-          <w:rFonts w:ascii="Arial" w:hAnsi="Arial" w:cs="Arial"/>
-          <w:color w:val="000000"/>
-          <w:sz w:val="20"/>
-          <w:szCs w:val="20"/>
-        </w:rPr>
-      </w:pPr>
-    </w:p>
-    <w:p>
-      <w:pPr>
-        <w:widowControl w:val="0"/>
-        <w:autoSpaceDE w:val="0"/>
-        <w:autoSpaceDN w:val="0"/>
-        <w:adjustRightInd w:val="0"/>
-        <w:spacing w:after="0" w:line="240" w:lineRule="auto"/>
-        <w:rPr>
-          <w:rFonts w:ascii="Arial" w:hAnsi="Arial" w:cs="Arial"/>
-          <w:color w:val="000000"/>
-          <w:sz w:val="20"/>
-          <w:szCs w:val="20"/>
-        </w:rPr>
-      </w:pPr>
-    </w:p>
-    <w:p>
-      <w:pPr>
-        <w:widowControl w:val="0"/>
-        <w:autoSpaceDE w:val="0"/>
-        <w:autoSpaceDN w:val="0"/>
-        <w:adjustRightInd w:val="0"/>
-        <w:spacing w:after="0" w:line="240" w:lineRule="auto"/>
-        <w:rPr>
-          <w:rFonts w:ascii="Arial" w:hAnsi="Arial" w:cs="Arial"/>
-          <w:color w:val="000000"/>
-          <w:sz w:val="20"/>
-          <w:szCs w:val="20"/>
-        </w:rPr>
-      </w:pPr>
-    </w:p>
-    <w:p>
-      <w:pPr>
-        <w:widowControl w:val="0"/>
-        <w:autoSpaceDE w:val="0"/>
-        <w:autoSpaceDN w:val="0"/>
-        <w:adjustRightInd w:val="0"/>
-        <w:spacing w:after="0" w:line="240" w:lineRule="auto"/>
-        <w:rPr>
-          <w:rFonts w:ascii="Arial" w:hAnsi="Arial" w:cs="Arial"/>
-          <w:color w:val="000000"/>
-          <w:sz w:val="20"/>
-          <w:szCs w:val="20"/>
-        </w:rPr>
-      </w:pPr>
-    </w:p>
-    <w:p>
-      <w:pPr>
-        <w:widowControl w:val="0"/>
-        <w:autoSpaceDE w:val="0"/>
-        <w:autoSpaceDN w:val="0"/>
-        <w:adjustRightInd w:val="0"/>
-        <w:spacing w:after="0" w:line="240" w:lineRule="auto"/>
-        <w:rPr>
-          <w:rFonts w:ascii="Arial" w:hAnsi="Arial" w:cs="Arial"/>
-          <w:color w:val="000000"/>
-          <w:sz w:val="20"/>
-          <w:szCs w:val="20"/>
-        </w:rPr>
-      </w:pPr>
-    </w:p>
-    <w:p>
-      <w:pPr>
-        <w:widowControl w:val="0"/>
-        <w:autoSpaceDE w:val="0"/>
-        <w:autoSpaceDN w:val="0"/>
-        <w:adjustRightInd w:val="0"/>
-        <w:spacing w:after="0" w:line="240" w:lineRule="auto"/>
-        <w:rPr>
-          <w:rFonts w:ascii="Arial" w:hAnsi="Arial" w:cs="Arial"/>
-          <w:color w:val="000000"/>
-          <w:sz w:val="20"/>
-          <w:szCs w:val="20"/>
-        </w:rPr>
-      </w:pPr>
-    </w:p>
-    <w:p>
-      <w:pPr>
-        <w:widowControl w:val="0"/>
-        <w:autoSpaceDE w:val="0"/>
-        <w:autoSpaceDN w:val="0"/>
-        <w:adjustRightInd w:val="0"/>
-        <w:spacing w:after="0" w:line="240" w:lineRule="auto"/>
-        <w:rPr>
-          <w:rFonts w:ascii="Arial" w:hAnsi="Arial" w:cs="Arial"/>
-          <w:color w:val="000000"/>
-          <w:sz w:val="20"/>
-          <w:szCs w:val="20"/>
-        </w:rPr>
-      </w:pPr>
-    </w:p>
-    <w:p>
-      <w:pPr>
-        <w:widowControl w:val="0"/>
-        <w:autoSpaceDE w:val="0"/>
-        <w:autoSpaceDN w:val="0"/>
-        <w:adjustRightInd w:val="0"/>
-        <w:spacing w:after="0" w:line="240" w:lineRule="auto"/>
-        <w:rPr>
-          <w:rFonts w:ascii="Arial" w:hAnsi="Arial" w:cs="Arial"/>
-          <w:color w:val="000000"/>
-          <w:sz w:val="20"/>
-          <w:szCs w:val="20"/>
-        </w:rPr>
-      </w:pPr>
-    </w:p>
-    <w:p>
-      <w:pPr>
-        <w:widowControl w:val="0"/>
-        <w:autoSpaceDE w:val="0"/>
-        <w:autoSpaceDN w:val="0"/>
-        <w:adjustRightInd w:val="0"/>
-        <w:spacing w:after="0" w:line="240" w:lineRule="auto"/>
-        <w:rPr>
-          <w:rFonts w:ascii="Arial" w:hAnsi="Arial" w:cs="Arial"/>
-          <w:color w:val="000000"/>
-          <w:sz w:val="20"/>
-          <w:szCs w:val="20"/>
-        </w:rPr>
-      </w:pPr>
-    </w:p>
-    <w:p>
-      <w:pPr>
-        <w:widowControl w:val="0"/>
-        <w:autoSpaceDE w:val="0"/>
-        <w:autoSpaceDN w:val="0"/>
-        <w:adjustRightInd w:val="0"/>
-        <w:spacing w:after="0" w:line="240" w:lineRule="auto"/>
-        <w:rPr>
-          <w:rFonts w:ascii="Arial" w:hAnsi="Arial" w:cs="Arial"/>
-          <w:color w:val="000000"/>
-          <w:sz w:val="20"/>
-          <w:szCs w:val="20"/>
-        </w:rPr>
-      </w:pPr>
-    </w:p>
-    <w:p>
-      <w:pPr>
-        <w:widowControl w:val="0"/>
-        <w:autoSpaceDE w:val="0"/>
-        <w:autoSpaceDN w:val="0"/>
-        <w:adjustRightInd w:val="0"/>
-        <w:spacing w:after="0" w:line="240" w:lineRule="auto"/>
-        <w:rPr>
-          <w:rFonts w:ascii="Arial" w:hAnsi="Arial" w:cs="Arial"/>
-          <w:color w:val="000000"/>
-          <w:sz w:val="20"/>
-          <w:szCs w:val="20"/>
-        </w:rPr>
-      </w:pPr>
-      <w:r>
-        <w:rPr>
-          <w:rFonts w:ascii="Arial" w:hAnsi="Arial" w:cs="Arial"/>
-          <w:color w:val="000000"/>
-          <w:sz w:val="20"/>
-          <w:szCs w:val="20"/>
-        </w:rPr>
-        <w:t>{</w:t>
-      </w:r>
-      <w:proofErr w:type="spellStart"/>
-      <w:r>
-        <w:rPr>
-          <w:rFonts w:ascii="Arial" w:hAnsi="Arial" w:cs="Arial"/>
-          <w:color w:val="000000"/>
-          <w:sz w:val="20"/>
-          <w:szCs w:val="20"/>
-        </w:rPr>
-        <w:t>Employee</w:t>
-      </w:r>
-      <w:r>
-        <w:rPr>
-          <w:rFonts w:ascii="Arial" w:hAnsi="Arial" w:cs="Arial"/>
-          <w:color w:val="000000"/>
-          <w:sz w:val="20"/>
-          <w:szCs w:val="20"/>
-        </w:rPr>
-        <w:t>N</w:t>
-      </w:r>
-      <w:r>
-        <w:rPr>
-          <w:rFonts w:ascii="Arial" w:hAnsi="Arial" w:cs="Arial"/>
-          <w:color w:val="000000"/>
-          <w:sz w:val="20"/>
-          <w:szCs w:val="20"/>
-        </w:rPr>
-        <w:t>ame</w:t>
-      </w:r>
-      <w:proofErr w:type="spellEnd"/>
-      <w:r>
-        <w:rPr>
-          <w:rFonts w:ascii="Arial" w:hAnsi="Arial" w:cs="Arial"/>
-          <w:color w:val="000000"/>
-          <w:sz w:val="20"/>
-          <w:szCs w:val="20"/>
-        </w:rPr>
-        <w:t>}</w:t>
-      </w:r>
-    </w:p>
-    <w:p>
-      <w:pPr>
-        <w:widowControl w:val="0"/>
-        <w:autoSpaceDE w:val="0"/>
-        <w:autoSpaceDN w:val="0"/>
-        <w:adjustRightInd w:val="0"/>
-        <w:spacing w:after="0" w:line="240" w:lineRule="auto"/>
-        <w:rPr>
-          <w:rFonts w:ascii="Arial" w:hAnsi="Arial" w:cs="Arial"/>
-          <w:color w:val="000000"/>
-          <w:sz w:val="20"/>
-          <w:szCs w:val="20"/>
-        </w:rPr>
-      </w:pPr>
-      <w:r>
-        <w:t>{</w:t>
-      </w:r>
-      <w:proofErr w:type="spellStart"/>
-      <w:r>
-        <w:t>employeeEmail</w:t>
-      </w:r>
-      <w:proofErr w:type="spellEnd"/>
-      <w:r>
-        <w:t>}</w:t>
-      </w:r>
-      <w:r>
-        <w:rPr>
-          <w:rStyle w:val="Hyperlink"/>
-          <w:rFonts w:ascii="Arial" w:hAnsi="Arial" w:cs="Arial"/>
-          <w:sz w:val="20"/>
-          <w:szCs w:val="20"/>
-        </w:rPr>
-        <w:t xml:space="preserve"> </w:t>
-      </w:r>
-    </w:p>
-    <w:p>
-      <w:pPr>
-        <w:spacing w:after="0"/>
-        <w:rPr>
-          <w:rFonts w:ascii="Arial" w:hAnsi="Arial" w:cs="Arial"/>
-          <w:sz w:val="20"/>
-          <w:szCs w:val="20"/>
-        </w:rPr>
-      </w:pPr>
-      <w:r>
-        <w:rPr>
-          <w:rFonts w:ascii="Arial" w:hAnsi="Arial" w:cs="Arial"/>
-          <w:b/>
-          <w:bCs/>
-          <w:color w:val="000000"/>
-          <w:sz w:val="20"/>
-          <w:szCs w:val="20"/>
-        </w:rPr>
-        <w:t>Meridian</w:t>
-      </w:r>
-      <w:r>
-        <w:rPr>
-          <w:rFonts w:ascii="Arial" w:hAnsi="Arial" w:cs="Arial"/>
-          <w:b/>
-          <w:bCs/>
-          <w:color w:val="000000"/>
-          <w:sz w:val="20"/>
-          <w:szCs w:val="20"/>
-        </w:rPr>
-        <w:t xml:space="preserve"> (Pvt.) Ltd.</w:t>
       </w:r>
     </w:p>
     <w:sectPr>
       <w:headerReference w:type="default" r:id="rId7"/>
+      <w:footerReference w:type="default" r:id="rId8"/>
       <w:pgSz w:w="12240" w:h="15840"/>
       <w:pgMar w:top="1440" w:right="1440" w:bottom="1440" w:left="1440" w:header="432" w:footer="720" w:gutter="0"/>
       <w:cols w:space="720"/>
@@ -2302,6 +1914,149 @@
 </w:endnotes>
 </file>
 
+<file path=word/footer1.xml><?xml version="1.0" encoding="utf-8"?>
+<w:ftr xmlns:wpc="http://schemas.microsoft.com/office/word/2010/wordprocessingCanvas" xmlns:cx="http://schemas.microsoft.com/office/drawing/2014/chartex" xmlns:cx1="http://schemas.microsoft.com/office/drawing/2015/9/8/chartex" xmlns:cx2="http://schemas.microsoft.com/office/drawing/2015/10/21/chartex" xmlns:cx3="http://schemas.microsoft.com/office/drawing/2016/5/9/chartex" xmlns:cx4="http://schemas.microsoft.com/office/drawing/2016/5/10/chartex" xmlns:cx5="http://schemas.microsoft.com/office/drawing/2016/5/11/chartex" xmlns:cx6="http://schemas.microsoft.com/office/drawing/2016/5/12/chartex" xmlns:cx7="http://schemas.microsoft.com/office/drawing/2016/5/13/chartex" xmlns:cx8="http://schemas.microsoft.com/office/drawing/2016/5/14/chartex" xmlns:mc="http://schemas.openxmlformats.org/markup-compatibility/2006" xmlns:aink="http://schemas.microsoft.com/office/drawing/2016/ink" xmlns:am3d="http://schemas.microsoft.com/office/drawing/2017/model3d" xmlns:o="urn:schemas-microsoft-com:office:office" xmlns:oel="http://schemas.microsoft.com/office/2019/extlst" xmlns:r="http://schemas.openxmlformats.org/officeDocument/2006/relationships" xmlns:m="http://schemas.openxmlformats.org/officeDocument/2006/math" xmlns:v="urn:schemas-microsoft-com:vml" xmlns:wp14="http://schemas.microsoft.com/office/word/2010/wordprocessingDrawing" xmlns:wp="http://schemas.openxmlformats.org/drawingml/2006/wordprocessingDrawing" xmlns:w10="urn:schemas-microsoft-com:office:word" xmlns:w="http://schemas.openxmlformats.org/wordprocessingml/2006/main" xmlns:w14="http://schemas.microsoft.com/office/word/2010/wordml" xmlns:w15="http://schemas.microsoft.com/office/word/2012/wordml" xmlns:w16cex="http://schemas.microsoft.com/office/word/2018/wordml/cex" xmlns:w16cid="http://schemas.microsoft.com/office/word/2016/wordml/cid" xmlns:w16="http://schemas.microsoft.com/office/word/2018/wordml" xmlns:w16du="http://schemas.microsoft.com/office/word/2023/wordml/word16du" xmlns:w16sdtdh="http://schemas.microsoft.com/office/word/2020/wordml/sdtdatahash" xmlns:w16sdtfl="http://schemas.microsoft.com/office/word/2024/wordml/sdtformatlock" xmlns:w16se="http://schemas.microsoft.com/office/word/2015/wordml/symex" xmlns:wpg="http://schemas.microsoft.com/office/word/2010/wordprocessingGroup" xmlns:wpi="http://schemas.microsoft.com/office/word/2010/wordprocessingInk" xmlns:wne="http://schemas.microsoft.com/office/word/2006/wordml" xmlns:wps="http://schemas.microsoft.com/office/word/2010/wordprocessingShape" mc:Ignorable="w14 w15 w16se w16cid w16 w16cex w16sdtdh w16sdtfl w16du wp14">
+  <w:p>
+    <w:pPr>
+      <w:widowControl w:val="0"/>
+      <w:autoSpaceDE w:val="0"/>
+      <w:autoSpaceDN w:val="0"/>
+      <w:adjustRightInd w:val="0"/>
+      <w:spacing w:after="0" w:line="240" w:lineRule="auto"/>
+      <w:rPr>
+        <w:rFonts w:ascii="Arial" w:hAnsi="Arial" w:cs="Arial"/>
+        <w:color w:val="000000"/>
+        <w:sz w:val="20"/>
+        <w:szCs w:val="20"/>
+      </w:rPr>
+    </w:pPr>
+    <w:r>
+      <w:rPr>
+        <w:rFonts w:ascii="Arial" w:hAnsi="Arial" w:cs="Arial"/>
+        <w:color w:val="000000"/>
+        <w:sz w:val="20"/>
+        <w:szCs w:val="20"/>
+      </w:rPr>
+      <w:t>{</w:t>
+    </w:r>
+    <w:proofErr w:type="spellStart"/>
+    <w:r>
+      <w:rPr>
+        <w:rFonts w:ascii="Arial" w:hAnsi="Arial" w:cs="Arial"/>
+        <w:color w:val="000000"/>
+        <w:sz w:val="20"/>
+        <w:szCs w:val="20"/>
+      </w:rPr>
+      <w:t>e</w:t>
+    </w:r>
+    <w:r>
+      <w:rPr>
+        <w:rFonts w:ascii="Arial" w:hAnsi="Arial" w:cs="Arial"/>
+        <w:color w:val="000000"/>
+        <w:sz w:val="20"/>
+        <w:szCs w:val="20"/>
+      </w:rPr>
+      <w:t>mployee</w:t>
+    </w:r>
+    <w:r>
+      <w:rPr>
+        <w:rFonts w:ascii="Arial" w:hAnsi="Arial" w:cs="Arial"/>
+        <w:color w:val="000000"/>
+        <w:sz w:val="20"/>
+        <w:szCs w:val="20"/>
+      </w:rPr>
+      <w:t>N</w:t>
+    </w:r>
+    <w:r>
+      <w:rPr>
+        <w:rFonts w:ascii="Arial" w:hAnsi="Arial" w:cs="Arial"/>
+        <w:color w:val="000000"/>
+        <w:sz w:val="20"/>
+        <w:szCs w:val="20"/>
+      </w:rPr>
+      <w:t>ame</w:t>
+    </w:r>
+    <w:proofErr w:type="spellEnd"/>
+    <w:r>
+      <w:rPr>
+        <w:rFonts w:ascii="Arial" w:hAnsi="Arial" w:cs="Arial"/>
+        <w:color w:val="000000"/>
+        <w:sz w:val="20"/>
+        <w:szCs w:val="20"/>
+      </w:rPr>
+      <w:t>}</w:t>
+    </w:r>
+  </w:p>
+  <w:p>
+    <w:pPr>
+      <w:widowControl w:val="0"/>
+      <w:autoSpaceDE w:val="0"/>
+      <w:autoSpaceDN w:val="0"/>
+      <w:adjustRightInd w:val="0"/>
+      <w:spacing w:after="0" w:line="240" w:lineRule="auto"/>
+      <w:rPr>
+        <w:rFonts w:ascii="Arial" w:hAnsi="Arial" w:cs="Arial"/>
+        <w:color w:val="000000"/>
+        <w:sz w:val="20"/>
+        <w:szCs w:val="20"/>
+      </w:rPr>
+    </w:pPr>
+    <w:r>
+      <w:t>{</w:t>
+    </w:r>
+    <w:proofErr w:type="spellStart"/>
+    <w:r>
+      <w:t>employeeEmail</w:t>
+    </w:r>
+    <w:proofErr w:type="spellEnd"/>
+    <w:r>
+      <w:t>}</w:t>
+    </w:r>
+    <w:r>
+      <w:rPr>
+        <w:rStyle w:val="Hyperlink"/>
+        <w:rFonts w:ascii="Arial" w:hAnsi="Arial" w:cs="Arial"/>
+        <w:sz w:val="20"/>
+        <w:szCs w:val="20"/>
+      </w:rPr>
+      <w:t xml:space="preserve"> </w:t>
+    </w:r>
+  </w:p>
+  <w:p>
+    <w:pPr>
+      <w:spacing w:after="0"/>
+      <w:rPr>
+        <w:rFonts w:ascii="Arial" w:hAnsi="Arial" w:cs="Arial"/>
+        <w:sz w:val="20"/>
+        <w:szCs w:val="20"/>
+      </w:rPr>
+    </w:pPr>
+    <w:r>
+      <w:rPr>
+        <w:rFonts w:ascii="Arial" w:hAnsi="Arial" w:cs="Arial"/>
+        <w:b/>
+        <w:bCs/>
+        <w:color w:val="000000"/>
+        <w:sz w:val="20"/>
+        <w:szCs w:val="20"/>
+      </w:rPr>
+      <w:t>Meridian</w:t>
+    </w:r>
+    <w:r>
+      <w:rPr>
+        <w:rFonts w:ascii="Arial" w:hAnsi="Arial" w:cs="Arial"/>
+        <w:b/>
+        <w:bCs/>
+        <w:color w:val="000000"/>
+        <w:sz w:val="20"/>
+        <w:szCs w:val="20"/>
+      </w:rPr>
+      <w:t xml:space="preserve"> (Pvt.) Ltd.</w:t>
+    </w:r>
+  </w:p>
+</w:ftr>
+</file>
+
 <file path=word/footnotes.xml><?xml version="1.0" encoding="utf-8"?>
 <w:footnotes xmlns:wpc="http://schemas.microsoft.com/office/word/2010/wordprocessingCanvas" xmlns:cx="http://schemas.microsoft.com/office/drawing/2014/chartex" xmlns:cx1="http://schemas.microsoft.com/office/drawing/2015/9/8/chartex" xmlns:cx2="http://schemas.microsoft.com/office/drawing/2015/10/21/chartex" xmlns:cx3="http://schemas.microsoft.com/office/drawing/2016/5/9/chartex" xmlns:cx4="http://schemas.microsoft.com/office/drawing/2016/5/10/chartex" xmlns:cx5="http://schemas.microsoft.com/office/drawing/2016/5/11/chartex" xmlns:cx6="http://schemas.microsoft.com/office/drawing/2016/5/12/chartex" xmlns:cx7="http://schemas.microsoft.com/office/drawing/2016/5/13/chartex" xmlns:cx8="http://schemas.microsoft.com/office/drawing/2016/5/14/chartex" xmlns:mc="http://schemas.openxmlformats.org/markup-compatibility/2006" xmlns:aink="http://schemas.microsoft.com/office/drawing/2016/ink" xmlns:am3d="http://schemas.microsoft.com/office/drawing/2017/model3d" xmlns:o="urn:schemas-microsoft-com:office:office" xmlns:oel="http://schemas.microsoft.com/office/2019/extlst" xmlns:r="http://schemas.openxmlformats.org/officeDocument/2006/relationships" xmlns:m="http://schemas.openxmlformats.org/officeDocument/2006/math" xmlns:v="urn:schemas-microsoft-com:vml" xmlns:wp14="http://schemas.microsoft.com/office/word/2010/wordprocessingDrawing" xmlns:wp="http://schemas.openxmlformats.org/drawingml/2006/wordprocessingDrawing" xmlns:w10="urn:schemas-microsoft-com:office:word" xmlns:w="http://schemas.openxmlformats.org/wordprocessingml/2006/main" xmlns:w14="http://schemas.microsoft.com/office/word/2010/wordml" xmlns:w15="http://schemas.microsoft.com/office/word/2012/wordml" xmlns:w16cex="http://schemas.microsoft.com/office/word/2018/wordml/cex" xmlns:w16cid="http://schemas.microsoft.com/office/word/2016/wordml/cid" xmlns:w16="http://schemas.microsoft.com/office/word/2018/wordml" xmlns:w16du="http://schemas.microsoft.com/office/word/2023/wordml/word16du" xmlns:w16sdtdh="http://schemas.microsoft.com/office/word/2020/wordml/sdtdatahash" xmlns:w16sdtfl="http://schemas.microsoft.com/office/word/2024/wordml/sdtformatlock" xmlns:w16se="http://schemas.microsoft.com/office/word/2015/wordml/symex" xmlns:wpg="http://schemas.microsoft.com/office/word/2010/wordprocessingGroup" xmlns:wpi="http://schemas.microsoft.com/office/word/2010/wordprocessingInk" xmlns:wne="http://schemas.microsoft.com/office/word/2006/wordml" xmlns:wps="http://schemas.microsoft.com/office/word/2010/wordprocessingShape" mc:Ignorable="w14 w15 w16se w16cid w16 w16cex w16sdtdh w16sdtfl w16du wp14">
   <w:footnote w:type="separator" w:id="-1">
@@ -2332,9 +2087,13 @@
   <w:p>
     <w:pPr>
       <w:pStyle w:val="Header"/>
+      <w:rPr>
+        <w:rFonts w:asciiTheme="majorHAnsi" w:hAnsiTheme="majorHAnsi"/>
+      </w:rPr>
     </w:pPr>
     <w:r>
       <w:rPr>
+        <w:rFonts w:asciiTheme="majorHAnsi" w:hAnsiTheme="majorHAnsi"/>
         <w:noProof/>
       </w:rPr>
       <w:drawing>
@@ -2394,79 +2153,82 @@
       </w:drawing>
     </w:r>
     <w:r>
+      <w:rPr>
+        <w:rFonts w:asciiTheme="majorHAnsi" w:hAnsiTheme="majorHAnsi"/>
+      </w:rPr>
       <w:t>Meridian</w:t>
     </w:r>
     <w:r>
+      <w:rPr>
+        <w:rFonts w:asciiTheme="majorHAnsi" w:hAnsiTheme="majorHAnsi"/>
+      </w:rPr>
       <w:tab/>
     </w:r>
     <w:r>
+      <w:rPr>
+        <w:rFonts w:asciiTheme="majorHAnsi" w:hAnsiTheme="majorHAnsi"/>
+      </w:rPr>
       <w:tab/>
-      <w:t xml:space="preserve">Page </w:t>
     </w:r>
     <w:r>
-      <w:t>{</w:t>
-    </w:r>
-    <w:proofErr w:type="spellStart"/>
-    <w:r>
-      <w:t>page</w:t>
-    </w:r>
-    <w:r>
-      <w:t>N</w:t>
-    </w:r>
-    <w:r>
-      <w:t>umber</w:t>
-    </w:r>
-    <w:proofErr w:type="spellEnd"/>
-    <w:r>
-      <w:t>}</w:t>
+      <w:rPr>
+        <w:rFonts w:asciiTheme="majorHAnsi" w:hAnsiTheme="majorHAnsi"/>
+      </w:rPr>
+      <w:t>Date: {date}</w:t>
     </w:r>
   </w:p>
   <w:p>
     <w:pPr>
       <w:pStyle w:val="Header"/>
+      <w:rPr>
+        <w:rFonts w:asciiTheme="majorHAnsi" w:hAnsiTheme="majorHAnsi"/>
+      </w:rPr>
     </w:pPr>
     <w:r>
+      <w:rPr>
+        <w:rFonts w:asciiTheme="majorHAnsi" w:hAnsiTheme="majorHAnsi"/>
+      </w:rPr>
       <w:t>Colombo, Sri Lanka</w:t>
-    </w:r>
-    <w:r>
-      <w:tab/>
-    </w:r>
-    <w:r>
-      <w:tab/>
-      <w:t xml:space="preserve">Date: </w:t>
-    </w:r>
-    <w:r>
-      <w:t>{</w:t>
-    </w:r>
-    <w:r>
-      <w:t>date</w:t>
-    </w:r>
-    <w:r>
-      <w:t>}</w:t>
     </w:r>
   </w:p>
   <w:p>
     <w:pPr>
       <w:pStyle w:val="Header"/>
+      <w:rPr>
+        <w:rFonts w:asciiTheme="majorHAnsi" w:hAnsiTheme="majorHAnsi"/>
+      </w:rPr>
     </w:pPr>
     <w:r>
+      <w:rPr>
+        <w:rFonts w:asciiTheme="majorHAnsi" w:hAnsiTheme="majorHAnsi"/>
+      </w:rPr>
       <w:t>Fax: +</w:t>
     </w:r>
     <w:r>
+      <w:rPr>
+        <w:rFonts w:asciiTheme="majorHAnsi" w:hAnsiTheme="majorHAnsi"/>
+      </w:rPr>
       <w:t>94-(0)11-2</w:t>
     </w:r>
     <w:r>
+      <w:rPr>
+        <w:rFonts w:asciiTheme="majorHAnsi" w:hAnsiTheme="majorHAnsi"/>
+      </w:rPr>
       <w:t>345678</w:t>
     </w:r>
   </w:p>
   <w:p>
     <w:pPr>
       <w:pStyle w:val="Header"/>
+      <w:rPr>
+        <w:rFonts w:asciiTheme="majorHAnsi" w:hAnsiTheme="majorHAnsi"/>
+      </w:rPr>
     </w:pPr>
     <w:hyperlink r:id="rId2" w:history="1">
       <w:r>
         <w:rPr>
           <w:rStyle w:val="Hyperlink"/>
+          <w:rFonts w:asciiTheme="majorHAnsi" w:hAnsiTheme="majorHAnsi"/>
         </w:rPr>
         <w:t>example@merid.com</w:t>
       </w:r>
@@ -2478,11 +2240,17 @@
       <w:pBdr>
         <w:bottom w:val="single" w:sz="4" w:space="1" w:color="auto"/>
       </w:pBdr>
+      <w:rPr>
+        <w:rFonts w:asciiTheme="majorHAnsi" w:hAnsiTheme="majorHAnsi"/>
+      </w:rPr>
     </w:pPr>
   </w:p>
   <w:p>
     <w:pPr>
       <w:pStyle w:val="Header"/>
+      <w:rPr>
+        <w:rFonts w:asciiTheme="majorHAnsi" w:hAnsiTheme="majorHAnsi"/>
+      </w:rPr>
     </w:pPr>
   </w:p>
 </w:hdr>
@@ -3922,6 +3690,304 @@
       </w:tcPr>
     </w:tblStylePr>
   </w:style>
+  <w:style w:type="table" w:styleId="PlainTable3">
+    <w:name w:val="Plain Table 3"/>
+    <w:basedOn w:val="TableNormal"/>
+    <w:uiPriority w:val="43"/>
+    <w:rsid w:val="00E006D1"/>
+    <w:pPr>
+      <w:spacing w:after="0" w:line="240" w:lineRule="auto"/>
+    </w:pPr>
+    <w:tblPr>
+      <w:tblStyleRowBandSize w:val="1"/>
+      <w:tblStyleColBandSize w:val="1"/>
+    </w:tblPr>
+    <w:tblStylePr w:type="firstRow">
+      <w:rPr>
+        <w:b/>
+        <w:bCs/>
+        <w:caps/>
+      </w:rPr>
+      <w:tblPr/>
+      <w:tcPr>
+        <w:tcBorders>
+          <w:bottom w:val="single" w:sz="4" w:space="0" w:color="7F7F7F" w:themeColor="text1" w:themeTint="80"/>
+        </w:tcBorders>
+      </w:tcPr>
+    </w:tblStylePr>
+    <w:tblStylePr w:type="lastRow">
+      <w:rPr>
+        <w:b/>
+        <w:bCs/>
+        <w:caps/>
+      </w:rPr>
+      <w:tblPr/>
+      <w:tcPr>
+        <w:tcBorders>
+          <w:top w:val="nil"/>
+        </w:tcBorders>
+      </w:tcPr>
+    </w:tblStylePr>
+    <w:tblStylePr w:type="firstCol">
+      <w:rPr>
+        <w:b/>
+        <w:bCs/>
+        <w:caps/>
+      </w:rPr>
+      <w:tblPr/>
+      <w:tcPr>
+        <w:tcBorders>
+          <w:right w:val="single" w:sz="4" w:space="0" w:color="7F7F7F" w:themeColor="text1" w:themeTint="80"/>
+        </w:tcBorders>
+      </w:tcPr>
+    </w:tblStylePr>
+    <w:tblStylePr w:type="lastCol">
+      <w:rPr>
+        <w:b/>
+        <w:bCs/>
+        <w:caps/>
+      </w:rPr>
+      <w:tblPr/>
+      <w:tcPr>
+        <w:tcBorders>
+          <w:left w:val="nil"/>
+        </w:tcBorders>
+      </w:tcPr>
+    </w:tblStylePr>
+    <w:tblStylePr w:type="band1Vert">
+      <w:tblPr/>
+      <w:tcPr>
+        <w:shd w:val="clear" w:color="auto" w:fill="F2F2F2" w:themeFill="background1" w:themeFillShade="F2"/>
+      </w:tcPr>
+    </w:tblStylePr>
+    <w:tblStylePr w:type="band1Horz">
+      <w:tblPr/>
+      <w:tcPr>
+        <w:shd w:val="clear" w:color="auto" w:fill="F2F2F2" w:themeFill="background1" w:themeFillShade="F2"/>
+      </w:tcPr>
+    </w:tblStylePr>
+    <w:tblStylePr w:type="neCell">
+      <w:tblPr/>
+      <w:tcPr>
+        <w:tcBorders>
+          <w:left w:val="nil"/>
+        </w:tcBorders>
+      </w:tcPr>
+    </w:tblStylePr>
+    <w:tblStylePr w:type="nwCell">
+      <w:tblPr/>
+      <w:tcPr>
+        <w:tcBorders>
+          <w:right w:val="nil"/>
+        </w:tcBorders>
+      </w:tcPr>
+    </w:tblStylePr>
+  </w:style>
+  <w:style w:type="table" w:styleId="GridTable1Light">
+    <w:name w:val="Grid Table 1 Light"/>
+    <w:basedOn w:val="TableNormal"/>
+    <w:uiPriority w:val="46"/>
+    <w:rsid w:val="007B44AE"/>
+    <w:pPr>
+      <w:spacing w:after="0" w:line="240" w:lineRule="auto"/>
+    </w:pPr>
+    <w:tblPr>
+      <w:tblStyleRowBandSize w:val="1"/>
+      <w:tblStyleColBandSize w:val="1"/>
+      <w:tblBorders>
+        <w:top w:val="single" w:sz="4" w:space="0" w:color="999999" w:themeColor="text1" w:themeTint="66"/>
+        <w:left w:val="single" w:sz="4" w:space="0" w:color="999999" w:themeColor="text1" w:themeTint="66"/>
+        <w:bottom w:val="single" w:sz="4" w:space="0" w:color="999999" w:themeColor="text1" w:themeTint="66"/>
+        <w:right w:val="single" w:sz="4" w:space="0" w:color="999999" w:themeColor="text1" w:themeTint="66"/>
+        <w:insideH w:val="single" w:sz="4" w:space="0" w:color="999999" w:themeColor="text1" w:themeTint="66"/>
+        <w:insideV w:val="single" w:sz="4" w:space="0" w:color="999999" w:themeColor="text1" w:themeTint="66"/>
+      </w:tblBorders>
+    </w:tblPr>
+    <w:tblStylePr w:type="firstRow">
+      <w:rPr>
+        <w:b/>
+        <w:bCs/>
+      </w:rPr>
+      <w:tblPr/>
+      <w:tcPr>
+        <w:tcBorders>
+          <w:bottom w:val="single" w:sz="12" w:space="0" w:color="666666" w:themeColor="text1" w:themeTint="99"/>
+        </w:tcBorders>
+      </w:tcPr>
+    </w:tblStylePr>
+    <w:tblStylePr w:type="lastRow">
+      <w:rPr>
+        <w:b/>
+        <w:bCs/>
+      </w:rPr>
+      <w:tblPr/>
+      <w:tcPr>
+        <w:tcBorders>
+          <w:top w:val="double" w:sz="2" w:space="0" w:color="666666" w:themeColor="text1" w:themeTint="99"/>
+        </w:tcBorders>
+      </w:tcPr>
+    </w:tblStylePr>
+    <w:tblStylePr w:type="firstCol">
+      <w:rPr>
+        <w:b/>
+        <w:bCs/>
+      </w:rPr>
+    </w:tblStylePr>
+    <w:tblStylePr w:type="lastCol">
+      <w:rPr>
+        <w:b/>
+        <w:bCs/>
+      </w:rPr>
+    </w:tblStylePr>
+  </w:style>
+  <w:style w:type="table" w:styleId="TableGridLight">
+    <w:name w:val="Grid Table Light"/>
+    <w:basedOn w:val="TableNormal"/>
+    <w:uiPriority w:val="40"/>
+    <w:rsid w:val="004144FD"/>
+    <w:pPr>
+      <w:spacing w:after="0" w:line="240" w:lineRule="auto"/>
+    </w:pPr>
+    <w:tblPr>
+      <w:tblBorders>
+        <w:top w:val="single" w:sz="4" w:space="0" w:color="BFBFBF" w:themeColor="background1" w:themeShade="BF"/>
+        <w:left w:val="single" w:sz="4" w:space="0" w:color="BFBFBF" w:themeColor="background1" w:themeShade="BF"/>
+        <w:bottom w:val="single" w:sz="4" w:space="0" w:color="BFBFBF" w:themeColor="background1" w:themeShade="BF"/>
+        <w:right w:val="single" w:sz="4" w:space="0" w:color="BFBFBF" w:themeColor="background1" w:themeShade="BF"/>
+        <w:insideH w:val="single" w:sz="4" w:space="0" w:color="BFBFBF" w:themeColor="background1" w:themeShade="BF"/>
+        <w:insideV w:val="single" w:sz="4" w:space="0" w:color="BFBFBF" w:themeColor="background1" w:themeShade="BF"/>
+      </w:tblBorders>
+    </w:tblPr>
+  </w:style>
+  <w:style w:type="table" w:styleId="PlainTable2">
+    <w:name w:val="Plain Table 2"/>
+    <w:basedOn w:val="TableNormal"/>
+    <w:uiPriority w:val="42"/>
+    <w:rsid w:val="00BE6AD9"/>
+    <w:pPr>
+      <w:spacing w:after="0" w:line="240" w:lineRule="auto"/>
+    </w:pPr>
+    <w:tblPr>
+      <w:tblStyleRowBandSize w:val="1"/>
+      <w:tblStyleColBandSize w:val="1"/>
+      <w:tblBorders>
+        <w:top w:val="single" w:sz="4" w:space="0" w:color="7F7F7F" w:themeColor="text1" w:themeTint="80"/>
+        <w:bottom w:val="single" w:sz="4" w:space="0" w:color="7F7F7F" w:themeColor="text1" w:themeTint="80"/>
+      </w:tblBorders>
+    </w:tblPr>
+    <w:tblStylePr w:type="firstRow">
+      <w:rPr>
+        <w:b/>
+        <w:bCs/>
+      </w:rPr>
+      <w:tblPr/>
+      <w:tcPr>
+        <w:tcBorders>
+          <w:bottom w:val="single" w:sz="4" w:space="0" w:color="7F7F7F" w:themeColor="text1" w:themeTint="80"/>
+        </w:tcBorders>
+      </w:tcPr>
+    </w:tblStylePr>
+    <w:tblStylePr w:type="lastRow">
+      <w:rPr>
+        <w:b/>
+        <w:bCs/>
+      </w:rPr>
+      <w:tblPr/>
+      <w:tcPr>
+        <w:tcBorders>
+          <w:top w:val="single" w:sz="4" w:space="0" w:color="7F7F7F" w:themeColor="text1" w:themeTint="80"/>
+        </w:tcBorders>
+      </w:tcPr>
+    </w:tblStylePr>
+    <w:tblStylePr w:type="firstCol">
+      <w:rPr>
+        <w:b/>
+        <w:bCs/>
+      </w:rPr>
+    </w:tblStylePr>
+    <w:tblStylePr w:type="lastCol">
+      <w:rPr>
+        <w:b/>
+        <w:bCs/>
+      </w:rPr>
+    </w:tblStylePr>
+    <w:tblStylePr w:type="band1Vert">
+      <w:tblPr/>
+      <w:tcPr>
+        <w:tcBorders>
+          <w:left w:val="single" w:sz="4" w:space="0" w:color="7F7F7F" w:themeColor="text1" w:themeTint="80"/>
+          <w:right w:val="single" w:sz="4" w:space="0" w:color="7F7F7F" w:themeColor="text1" w:themeTint="80"/>
+        </w:tcBorders>
+      </w:tcPr>
+    </w:tblStylePr>
+    <w:tblStylePr w:type="band2Vert">
+      <w:tblPr/>
+      <w:tcPr>
+        <w:tcBorders>
+          <w:left w:val="single" w:sz="4" w:space="0" w:color="7F7F7F" w:themeColor="text1" w:themeTint="80"/>
+          <w:right w:val="single" w:sz="4" w:space="0" w:color="7F7F7F" w:themeColor="text1" w:themeTint="80"/>
+        </w:tcBorders>
+      </w:tcPr>
+    </w:tblStylePr>
+    <w:tblStylePr w:type="band1Horz">
+      <w:tblPr/>
+      <w:tcPr>
+        <w:tcBorders>
+          <w:top w:val="single" w:sz="4" w:space="0" w:color="7F7F7F" w:themeColor="text1" w:themeTint="80"/>
+          <w:bottom w:val="single" w:sz="4" w:space="0" w:color="7F7F7F" w:themeColor="text1" w:themeTint="80"/>
+        </w:tcBorders>
+      </w:tcPr>
+    </w:tblStylePr>
+  </w:style>
+  <w:style w:type="table" w:styleId="PlainTable4">
+    <w:name w:val="Plain Table 4"/>
+    <w:basedOn w:val="TableNormal"/>
+    <w:uiPriority w:val="44"/>
+    <w:rsid w:val="00BE6AD9"/>
+    <w:pPr>
+      <w:spacing w:after="0" w:line="240" w:lineRule="auto"/>
+    </w:pPr>
+    <w:tblPr>
+      <w:tblStyleRowBandSize w:val="1"/>
+      <w:tblStyleColBandSize w:val="1"/>
+    </w:tblPr>
+    <w:tblStylePr w:type="firstRow">
+      <w:rPr>
+        <w:b/>
+        <w:bCs/>
+      </w:rPr>
+    </w:tblStylePr>
+    <w:tblStylePr w:type="lastRow">
+      <w:rPr>
+        <w:b/>
+        <w:bCs/>
+      </w:rPr>
+    </w:tblStylePr>
+    <w:tblStylePr w:type="firstCol">
+      <w:rPr>
+        <w:b/>
+        <w:bCs/>
+      </w:rPr>
+    </w:tblStylePr>
+    <w:tblStylePr w:type="lastCol">
+      <w:rPr>
+        <w:b/>
+        <w:bCs/>
+      </w:rPr>
+    </w:tblStylePr>
+    <w:tblStylePr w:type="band1Vert">
+      <w:tblPr/>
+      <w:tcPr>
+        <w:shd w:val="clear" w:color="auto" w:fill="F2F2F2" w:themeFill="background1" w:themeFillShade="F2"/>
+      </w:tcPr>
+    </w:tblStylePr>
+    <w:tblStylePr w:type="band1Horz">
+      <w:tblPr/>
+      <w:tcPr>
+        <w:shd w:val="clear" w:color="auto" w:fill="F2F2F2" w:themeFill="background1" w:themeFillShade="F2"/>
+      </w:tcPr>
+    </w:tblStylePr>
+  </w:style>
 </w:styles>
 </file>
 

</xml_diff>

<commit_message>
feat: initialize Meridian Voucher Studio with core UI components, electron backend services, and containerized deployment configuration
</commit_message>
<xml_diff>
--- a/templates/voucher-template.docx
+++ b/templates/voucher-template.docx
@@ -251,14 +251,14 @@
       </w:tblPr>
       <w:tblGrid>
         <w:gridCol w:w="1885"/>
-        <w:gridCol w:w="1623"/>
-        <w:gridCol w:w="987"/>
-        <w:gridCol w:w="898"/>
-        <w:gridCol w:w="902"/>
-        <w:gridCol w:w="808"/>
-        <w:gridCol w:w="812"/>
-        <w:gridCol w:w="898"/>
-        <w:gridCol w:w="1282"/>
+        <w:gridCol w:w="1622"/>
+        <w:gridCol w:w="988"/>
+        <w:gridCol w:w="897"/>
+        <w:gridCol w:w="903"/>
+        <w:gridCol w:w="807"/>
+        <w:gridCol w:w="813"/>
+        <w:gridCol w:w="897"/>
+        <w:gridCol w:w="1283"/>
         <w:gridCol w:w="1420"/>
       </w:tblGrid>
       <w:tr>
@@ -317,7 +317,7 @@
         </w:tc>
         <w:tc>
           <w:tcPr>
-            <w:tcW w:w="1623" w:type="dxa"/>
+            <w:tcW w:w="1622" w:type="dxa"/>
             <w:tcBorders>
               <w:top w:val="single" w:sz="6" w:space="0" w:color="000000"/>
               <w:bottom w:val="single" w:sz="6" w:space="0" w:color="000000"/>
@@ -366,7 +366,7 @@
         </w:tc>
         <w:tc>
           <w:tcPr>
-            <w:tcW w:w="987" w:type="dxa"/>
+            <w:tcW w:w="988" w:type="dxa"/>
             <w:tcBorders>
               <w:top w:val="single" w:sz="6" w:space="0" w:color="000000"/>
               <w:bottom w:val="single" w:sz="6" w:space="0" w:color="000000"/>
@@ -415,7 +415,7 @@
         </w:tc>
         <w:tc>
           <w:tcPr>
-            <w:tcW w:w="898" w:type="dxa"/>
+            <w:tcW w:w="897" w:type="dxa"/>
             <w:tcBorders>
               <w:top w:val="single" w:sz="6" w:space="0" w:color="000000"/>
               <w:bottom w:val="single" w:sz="6" w:space="0" w:color="000000"/>
@@ -464,7 +464,7 @@
         </w:tc>
         <w:tc>
           <w:tcPr>
-            <w:tcW w:w="902" w:type="dxa"/>
+            <w:tcW w:w="903" w:type="dxa"/>
             <w:tcBorders>
               <w:top w:val="single" w:sz="6" w:space="0" w:color="000000"/>
               <w:bottom w:val="single" w:sz="6" w:space="0" w:color="000000"/>
@@ -513,7 +513,7 @@
         </w:tc>
         <w:tc>
           <w:tcPr>
-            <w:tcW w:w="808" w:type="dxa"/>
+            <w:tcW w:w="807" w:type="dxa"/>
             <w:tcBorders>
               <w:top w:val="single" w:sz="6" w:space="0" w:color="000000"/>
               <w:bottom w:val="single" w:sz="6" w:space="0" w:color="000000"/>
@@ -562,7 +562,7 @@
         </w:tc>
         <w:tc>
           <w:tcPr>
-            <w:tcW w:w="812" w:type="dxa"/>
+            <w:tcW w:w="813" w:type="dxa"/>
             <w:tcBorders>
               <w:top w:val="single" w:sz="6" w:space="0" w:color="000000"/>
               <w:bottom w:val="single" w:sz="6" w:space="0" w:color="000000"/>
@@ -611,7 +611,7 @@
         </w:tc>
         <w:tc>
           <w:tcPr>
-            <w:tcW w:w="898" w:type="dxa"/>
+            <w:tcW w:w="897" w:type="dxa"/>
             <w:tcBorders>
               <w:top w:val="single" w:sz="6" w:space="0" w:color="000000"/>
               <w:bottom w:val="single" w:sz="6" w:space="0" w:color="000000"/>
@@ -660,7 +660,7 @@
         </w:tc>
         <w:tc>
           <w:tcPr>
-            <w:tcW w:w="1282" w:type="dxa"/>
+            <w:tcW w:w="1283" w:type="dxa"/>
             <w:tcBorders>
               <w:top w:val="single" w:sz="6" w:space="0" w:color="000000"/>
               <w:bottom w:val="single" w:sz="6" w:space="0" w:color="000000"/>
@@ -769,6 +769,7 @@
             <w:tcBorders>
               <w:bottom w:val="single" w:sz="6" w:space="0" w:color="000000"/>
             </w:tcBorders>
+            <w:shd w:color="auto" w:fill="F2F2F2" w:themeFill="background1" w:themeFillShade="f2" w:val="clear"/>
           </w:tcPr>
           <w:p>
             <w:pPr>
@@ -812,10 +813,11 @@
         </w:tc>
         <w:tc>
           <w:tcPr>
-            <w:tcW w:w="1623" w:type="dxa"/>
+            <w:tcW w:w="1622" w:type="dxa"/>
             <w:tcBorders>
               <w:bottom w:val="single" w:sz="6" w:space="0" w:color="000000"/>
             </w:tcBorders>
+            <w:shd w:color="auto" w:fill="F2F2F2" w:themeFill="background1" w:themeFillShade="f2" w:val="clear"/>
           </w:tcPr>
           <w:p>
             <w:pPr>
@@ -858,10 +860,11 @@
         </w:tc>
         <w:tc>
           <w:tcPr>
-            <w:tcW w:w="987" w:type="dxa"/>
+            <w:tcW w:w="988" w:type="dxa"/>
             <w:tcBorders>
               <w:bottom w:val="single" w:sz="6" w:space="0" w:color="000000"/>
             </w:tcBorders>
+            <w:shd w:color="auto" w:fill="F2F2F2" w:themeFill="background1" w:themeFillShade="f2" w:val="clear"/>
           </w:tcPr>
           <w:p>
             <w:pPr>
@@ -904,10 +907,11 @@
         </w:tc>
         <w:tc>
           <w:tcPr>
-            <w:tcW w:w="898" w:type="dxa"/>
+            <w:tcW w:w="897" w:type="dxa"/>
             <w:tcBorders>
               <w:bottom w:val="single" w:sz="6" w:space="0" w:color="000000"/>
             </w:tcBorders>
+            <w:shd w:color="auto" w:fill="F2F2F2" w:themeFill="background1" w:themeFillShade="f2" w:val="clear"/>
           </w:tcPr>
           <w:p>
             <w:pPr>
@@ -950,10 +954,11 @@
         </w:tc>
         <w:tc>
           <w:tcPr>
-            <w:tcW w:w="902" w:type="dxa"/>
+            <w:tcW w:w="903" w:type="dxa"/>
             <w:tcBorders>
               <w:bottom w:val="single" w:sz="6" w:space="0" w:color="000000"/>
             </w:tcBorders>
+            <w:shd w:color="auto" w:fill="F2F2F2" w:themeFill="background1" w:themeFillShade="f2" w:val="clear"/>
           </w:tcPr>
           <w:p>
             <w:pPr>
@@ -996,10 +1001,11 @@
         </w:tc>
         <w:tc>
           <w:tcPr>
-            <w:tcW w:w="808" w:type="dxa"/>
+            <w:tcW w:w="807" w:type="dxa"/>
             <w:tcBorders>
               <w:bottom w:val="single" w:sz="6" w:space="0" w:color="000000"/>
             </w:tcBorders>
+            <w:shd w:color="auto" w:fill="F2F2F2" w:themeFill="background1" w:themeFillShade="f2" w:val="clear"/>
           </w:tcPr>
           <w:p>
             <w:pPr>
@@ -1042,10 +1048,11 @@
         </w:tc>
         <w:tc>
           <w:tcPr>
-            <w:tcW w:w="812" w:type="dxa"/>
+            <w:tcW w:w="813" w:type="dxa"/>
             <w:tcBorders>
               <w:bottom w:val="single" w:sz="6" w:space="0" w:color="000000"/>
             </w:tcBorders>
+            <w:shd w:color="auto" w:fill="F2F2F2" w:themeFill="background1" w:themeFillShade="f2" w:val="clear"/>
           </w:tcPr>
           <w:p>
             <w:pPr>
@@ -1088,10 +1095,11 @@
         </w:tc>
         <w:tc>
           <w:tcPr>
-            <w:tcW w:w="898" w:type="dxa"/>
+            <w:tcW w:w="897" w:type="dxa"/>
             <w:tcBorders>
               <w:bottom w:val="single" w:sz="6" w:space="0" w:color="000000"/>
             </w:tcBorders>
+            <w:shd w:color="auto" w:fill="F2F2F2" w:themeFill="background1" w:themeFillShade="f2" w:val="clear"/>
           </w:tcPr>
           <w:p>
             <w:pPr>
@@ -1134,10 +1142,11 @@
         </w:tc>
         <w:tc>
           <w:tcPr>
-            <w:tcW w:w="1282" w:type="dxa"/>
+            <w:tcW w:w="1283" w:type="dxa"/>
             <w:tcBorders>
               <w:bottom w:val="single" w:sz="6" w:space="0" w:color="000000"/>
             </w:tcBorders>
+            <w:shd w:color="auto" w:fill="F2F2F2" w:themeFill="background1" w:themeFillShade="f2" w:val="clear"/>
           </w:tcPr>
           <w:p>
             <w:pPr>
@@ -1197,20 +1206,11 @@
             </w:pPr>
             <w:r>
               <w:rPr>
-                <w:rFonts w:eastAsia="Aptos" w:cs="Calibri" w:ascii="Liberation Serif" w:hAnsi="Liberation Serif"/>
-                <w:b w:val="false"/>
-                <w:bCs w:val="false"/>
-                <w:i w:val="false"/>
-                <w:iCs w:val="false"/>
-                <w:strike w:val="false"/>
-                <w:dstrike w:val="false"/>
-                <w:outline w:val="false"/>
-                <w:shadow w:val="false"/>
+                <w:rFonts w:eastAsia="Aptos" w:cs="Calibri" w:ascii="Arial" w:hAnsi="Arial"/>
                 <w:color w:val="000000"/>
                 <w:kern w:val="2"/>
-                <w:sz w:val="24"/>
-                <w:szCs w:val="24"/>
-                <w:u w:val="none"/>
+                <w:sz w:val="20"/>
+                <w:szCs w:val="20"/>
                 <w:lang w:val="en-US" w:eastAsia="en-US" w:bidi="ar-SA"/>
               </w:rPr>
             </w:r>
@@ -1222,6 +1222,7 @@
             <w:tcBorders>
               <w:bottom w:val="single" w:sz="6" w:space="0" w:color="000000"/>
             </w:tcBorders>
+            <w:shd w:color="auto" w:fill="F2F2F2" w:themeFill="background1" w:themeFillShade="f2" w:val="clear"/>
           </w:tcPr>
           <w:p>
             <w:pPr>
@@ -1712,10 +1713,14 @@
         <w:szCs w:val="20"/>
       </w:rPr>
     </w:pPr>
-    <w:r>
-      <w:rPr/>
-      <w:t>{employeeEmail}</w:t>
-    </w:r>
+    <w:hyperlink r:id="rId1">
+      <w:r>
+        <w:rPr>
+          <w:rStyle w:val="Hyperlink"/>
+        </w:rPr>
+        <w:t>{employeeEmail}</w:t>
+      </w:r>
+    </w:hyperlink>
     <w:r>
       <w:rPr>
         <w:rStyle w:val="Hyperlink"/>
@@ -1787,10 +1792,14 @@
         <w:szCs w:val="20"/>
       </w:rPr>
     </w:pPr>
-    <w:r>
-      <w:rPr/>
-      <w:t>{employeeEmail}</w:t>
-    </w:r>
+    <w:hyperlink r:id="rId1">
+      <w:r>
+        <w:rPr>
+          <w:rStyle w:val="Hyperlink"/>
+        </w:rPr>
+        <w:t>{employeeEmail}</w:t>
+      </w:r>
+    </w:hyperlink>
     <w:r>
       <w:rPr>
         <w:rStyle w:val="Hyperlink"/>
@@ -3205,15 +3214,15 @@
     </w:pPr>
     <w:rPr/>
   </w:style>
+  <w:style w:type="paragraph" w:styleId="FrameContents">
+    <w:name w:val="Frame Contents"/>
+    <w:basedOn w:val="Normal"/>
+    <w:qFormat/>
+    <w:pPr/>
+    <w:rPr/>
+  </w:style>
   <w:style w:type="paragraph" w:styleId="FrameContentsuser">
     <w:name w:val="Frame Contents (user)"/>
-    <w:basedOn w:val="Normal"/>
-    <w:qFormat/>
-    <w:pPr/>
-    <w:rPr/>
-  </w:style>
-  <w:style w:type="paragraph" w:styleId="FrameContents">
-    <w:name w:val="Frame Contents"/>
     <w:basedOn w:val="Normal"/>
     <w:qFormat/>
     <w:pPr/>

</xml_diff>